<commit_message>
fix: update table of contents page numbers in technical report
</commit_message>
<xml_diff>
--- a/docs/report/TECHNICAL_REPORT.docx
+++ b/docs/report/TECHNICAL_REPORT.docx
@@ -117,10 +117,7 @@
         <w:jc w:val="center"/>
       </w:pPr>
       <w:r>
-        <w:t xml:space="preserve">Lecturer: _________________________________</w:t>
-      </w:r>
-      <w:r>
-        <w:t/>
+        <w:t>Lecturer: _________________________________</w:t>
       </w:r>
     </w:p>
     <w:p>
@@ -154,6 +151,14 @@
     </w:p>
     <w:sdt>
       <w:sdtPr>
+        <w:rPr>
+          <w:rFonts w:ascii="Times New Roman" w:eastAsia="Times New Roman" w:hAnsi="Times New Roman" w:cstheme="minorBidi"/>
+          <w:b w:val="0"/>
+          <w:bCs w:val="0"/>
+          <w:color w:val="auto"/>
+          <w:sz w:val="24"/>
+          <w:szCs w:val="22"/>
+        </w:rPr>
         <w:id w:val="1493758180"/>
         <w:docPartObj>
           <w:docPartGallery w:val="Table of Contents"/>
@@ -162,11 +167,7 @@
       </w:sdtPr>
       <w:sdtEndPr>
         <w:rPr>
-          <w:rFonts w:ascii="Times New Roman" w:eastAsia="Times New Roman" w:hAnsi="Times New Roman" w:cstheme="minorBidi"/>
           <w:noProof/>
-          <w:color w:val="auto"/>
-          <w:sz w:val="24"/>
-          <w:szCs w:val="22"/>
         </w:rPr>
       </w:sdtEndPr>
       <w:sdtContent>
@@ -177,6 +178,8 @@
           <w:r>
             <w:t>Contents</w:t>
           </w:r>
+          <w:bookmarkStart w:id="0" w:name="_GoBack"/>
+          <w:bookmarkEnd w:id="0"/>
         </w:p>
         <w:p>
           <w:pPr>
@@ -185,7 +188,9 @@
               <w:tab w:val="right" w:leader="dot" w:pos="9628"/>
             </w:tabs>
             <w:rPr>
+              <w:rFonts w:asciiTheme="minorHAnsi" w:eastAsiaTheme="minorEastAsia" w:hAnsiTheme="minorHAnsi"/>
               <w:noProof/>
+              <w:sz w:val="22"/>
             </w:rPr>
           </w:pPr>
           <w:r>
@@ -197,7 +202,7 @@
           <w:r>
             <w:fldChar w:fldCharType="separate"/>
           </w:r>
-          <w:hyperlink w:anchor="_Toc238498237" w:history="1">
+          <w:hyperlink w:anchor="_Toc238500408" w:history="1">
             <w:r>
               <w:rPr>
                 <w:rStyle w:val="Hyperlink"/>
@@ -225,7 +230,7 @@
                 <w:noProof/>
                 <w:webHidden/>
               </w:rPr>
-              <w:instrText xml:space="preserve"> PAGEREF _Toc238498237 \h </w:instrText>
+              <w:instrText xml:space="preserve"> PAGEREF _Toc238500408 \h </w:instrText>
             </w:r>
             <w:r>
               <w:rPr>
@@ -245,7 +250,7 @@
                 <w:noProof/>
                 <w:webHidden/>
               </w:rPr>
-              <w:t>3</w:t>
+              <w:t>4</w:t>
             </w:r>
             <w:r>
               <w:rPr>
@@ -263,10 +268,12 @@
               <w:tab w:val="right" w:leader="dot" w:pos="9628"/>
             </w:tabs>
             <w:rPr>
+              <w:rFonts w:asciiTheme="minorHAnsi" w:eastAsiaTheme="minorEastAsia" w:hAnsiTheme="minorHAnsi"/>
               <w:noProof/>
+              <w:sz w:val="22"/>
             </w:rPr>
           </w:pPr>
-          <w:hyperlink w:anchor="_Toc238498238" w:history="1">
+          <w:hyperlink w:anchor="_Toc238500409" w:history="1">
             <w:r>
               <w:rPr>
                 <w:rStyle w:val="Hyperlink"/>
@@ -294,7 +301,7 @@
                 <w:noProof/>
                 <w:webHidden/>
               </w:rPr>
-              <w:instrText xml:space="preserve"> PAGEREF _Toc238498238 \h </w:instrText>
+              <w:instrText xml:space="preserve"> PAGEREF _Toc238500409 \h </w:instrText>
             </w:r>
             <w:r>
               <w:rPr>
@@ -314,7 +321,7 @@
                 <w:noProof/>
                 <w:webHidden/>
               </w:rPr>
-              <w:t>4</w:t>
+              <w:t>5</w:t>
             </w:r>
             <w:r>
               <w:rPr>
@@ -332,10 +339,12 @@
               <w:tab w:val="right" w:leader="dot" w:pos="9628"/>
             </w:tabs>
             <w:rPr>
+              <w:rFonts w:asciiTheme="minorHAnsi" w:eastAsiaTheme="minorEastAsia" w:hAnsiTheme="minorHAnsi"/>
               <w:noProof/>
+              <w:sz w:val="22"/>
             </w:rPr>
           </w:pPr>
-          <w:hyperlink w:anchor="_Toc238498239" w:history="1">
+          <w:hyperlink w:anchor="_Toc238500410" w:history="1">
             <w:r>
               <w:rPr>
                 <w:rStyle w:val="Hyperlink"/>
@@ -363,7 +372,7 @@
                 <w:noProof/>
                 <w:webHidden/>
               </w:rPr>
-              <w:instrText xml:space="preserve"> PAGEREF _Toc238498239 \h </w:instrText>
+              <w:instrText xml:space="preserve"> PAGEREF _Toc238500410 \h </w:instrText>
             </w:r>
             <w:r>
               <w:rPr>
@@ -383,7 +392,7 @@
                 <w:noProof/>
                 <w:webHidden/>
               </w:rPr>
-              <w:t>4</w:t>
+              <w:t>5</w:t>
             </w:r>
             <w:r>
               <w:rPr>
@@ -401,10 +410,12 @@
               <w:tab w:val="right" w:leader="dot" w:pos="9628"/>
             </w:tabs>
             <w:rPr>
+              <w:rFonts w:asciiTheme="minorHAnsi" w:eastAsiaTheme="minorEastAsia" w:hAnsiTheme="minorHAnsi"/>
               <w:noProof/>
+              <w:sz w:val="22"/>
             </w:rPr>
           </w:pPr>
-          <w:hyperlink w:anchor="_Toc238498240" w:history="1">
+          <w:hyperlink w:anchor="_Toc238500411" w:history="1">
             <w:r>
               <w:rPr>
                 <w:rStyle w:val="Hyperlink"/>
@@ -432,7 +443,7 @@
                 <w:noProof/>
                 <w:webHidden/>
               </w:rPr>
-              <w:instrText xml:space="preserve"> PAGEREF _Toc238498240 \h </w:instrText>
+              <w:instrText xml:space="preserve"> PAGEREF _Toc238500411 \h </w:instrText>
             </w:r>
             <w:r>
               <w:rPr>
@@ -452,7 +463,7 @@
                 <w:noProof/>
                 <w:webHidden/>
               </w:rPr>
-              <w:t>4</w:t>
+              <w:t>5</w:t>
             </w:r>
             <w:r>
               <w:rPr>
@@ -470,10 +481,12 @@
               <w:tab w:val="right" w:leader="dot" w:pos="9628"/>
             </w:tabs>
             <w:rPr>
+              <w:rFonts w:asciiTheme="minorHAnsi" w:eastAsiaTheme="minorEastAsia" w:hAnsiTheme="minorHAnsi"/>
               <w:noProof/>
+              <w:sz w:val="22"/>
             </w:rPr>
           </w:pPr>
-          <w:hyperlink w:anchor="_Toc238498241" w:history="1">
+          <w:hyperlink w:anchor="_Toc238500412" w:history="1">
             <w:r>
               <w:rPr>
                 <w:rStyle w:val="Hyperlink"/>
@@ -501,7 +514,7 @@
                 <w:noProof/>
                 <w:webHidden/>
               </w:rPr>
-              <w:instrText xml:space="preserve"> PAGEREF _Toc238498241 \h </w:instrText>
+              <w:instrText xml:space="preserve"> PAGEREF _Toc238500412 \h </w:instrText>
             </w:r>
             <w:r>
               <w:rPr>
@@ -521,7 +534,7 @@
                 <w:noProof/>
                 <w:webHidden/>
               </w:rPr>
-              <w:t>4</w:t>
+              <w:t>5</w:t>
             </w:r>
             <w:r>
               <w:rPr>
@@ -539,10 +552,12 @@
               <w:tab w:val="right" w:leader="dot" w:pos="9628"/>
             </w:tabs>
             <w:rPr>
+              <w:rFonts w:asciiTheme="minorHAnsi" w:eastAsiaTheme="minorEastAsia" w:hAnsiTheme="minorHAnsi"/>
               <w:noProof/>
+              <w:sz w:val="22"/>
             </w:rPr>
           </w:pPr>
-          <w:hyperlink w:anchor="_Toc238498242" w:history="1">
+          <w:hyperlink w:anchor="_Toc238500413" w:history="1">
             <w:r>
               <w:rPr>
                 <w:rStyle w:val="Hyperlink"/>
@@ -570,7 +585,7 @@
                 <w:noProof/>
                 <w:webHidden/>
               </w:rPr>
-              <w:instrText xml:space="preserve"> PAGEREF _Toc238498242 \h </w:instrText>
+              <w:instrText xml:space="preserve"> PAGEREF _Toc238500413 \h </w:instrText>
             </w:r>
             <w:r>
               <w:rPr>
@@ -590,7 +605,7 @@
                 <w:noProof/>
                 <w:webHidden/>
               </w:rPr>
-              <w:t>4</w:t>
+              <w:t>5</w:t>
             </w:r>
             <w:r>
               <w:rPr>
@@ -608,10 +623,12 @@
               <w:tab w:val="right" w:leader="dot" w:pos="9628"/>
             </w:tabs>
             <w:rPr>
+              <w:rFonts w:asciiTheme="minorHAnsi" w:eastAsiaTheme="minorEastAsia" w:hAnsiTheme="minorHAnsi"/>
               <w:noProof/>
+              <w:sz w:val="22"/>
             </w:rPr>
           </w:pPr>
-          <w:hyperlink w:anchor="_Toc238498243" w:history="1">
+          <w:hyperlink w:anchor="_Toc238500414" w:history="1">
             <w:r>
               <w:rPr>
                 <w:rStyle w:val="Hyperlink"/>
@@ -639,7 +656,7 @@
                 <w:noProof/>
                 <w:webHidden/>
               </w:rPr>
-              <w:instrText xml:space="preserve"> PAGEREF _Toc238498243 \h </w:instrText>
+              <w:instrText xml:space="preserve"> PAGEREF _Toc238500414 \h </w:instrText>
             </w:r>
             <w:r>
               <w:rPr>
@@ -659,7 +676,7 @@
                 <w:noProof/>
                 <w:webHidden/>
               </w:rPr>
-              <w:t>5</w:t>
+              <w:t>6</w:t>
             </w:r>
             <w:r>
               <w:rPr>
@@ -677,10 +694,12 @@
               <w:tab w:val="right" w:leader="dot" w:pos="9628"/>
             </w:tabs>
             <w:rPr>
+              <w:rFonts w:asciiTheme="minorHAnsi" w:eastAsiaTheme="minorEastAsia" w:hAnsiTheme="minorHAnsi"/>
               <w:noProof/>
+              <w:sz w:val="22"/>
             </w:rPr>
           </w:pPr>
-          <w:hyperlink w:anchor="_Toc238498244" w:history="1">
+          <w:hyperlink w:anchor="_Toc238500415" w:history="1">
             <w:r>
               <w:rPr>
                 <w:rStyle w:val="Hyperlink"/>
@@ -708,7 +727,7 @@
                 <w:noProof/>
                 <w:webHidden/>
               </w:rPr>
-              <w:instrText xml:space="preserve"> PAGEREF _Toc238498244 \h </w:instrText>
+              <w:instrText xml:space="preserve"> PAGEREF _Toc238500415 \h </w:instrText>
             </w:r>
             <w:r>
               <w:rPr>
@@ -728,7 +747,7 @@
                 <w:noProof/>
                 <w:webHidden/>
               </w:rPr>
-              <w:t>6</w:t>
+              <w:t>7</w:t>
             </w:r>
             <w:r>
               <w:rPr>
@@ -746,10 +765,12 @@
               <w:tab w:val="right" w:leader="dot" w:pos="9628"/>
             </w:tabs>
             <w:rPr>
+              <w:rFonts w:asciiTheme="minorHAnsi" w:eastAsiaTheme="minorEastAsia" w:hAnsiTheme="minorHAnsi"/>
               <w:noProof/>
+              <w:sz w:val="22"/>
             </w:rPr>
           </w:pPr>
-          <w:hyperlink w:anchor="_Toc238498245" w:history="1">
+          <w:hyperlink w:anchor="_Toc238500416" w:history="1">
             <w:r>
               <w:rPr>
                 <w:rStyle w:val="Hyperlink"/>
@@ -777,7 +798,7 @@
                 <w:noProof/>
                 <w:webHidden/>
               </w:rPr>
-              <w:instrText xml:space="preserve"> PAGEREF _Toc238498245 \h </w:instrText>
+              <w:instrText xml:space="preserve"> PAGEREF _Toc238500416 \h </w:instrText>
             </w:r>
             <w:r>
               <w:rPr>
@@ -797,7 +818,7 @@
                 <w:noProof/>
                 <w:webHidden/>
               </w:rPr>
-              <w:t>6</w:t>
+              <w:t>7</w:t>
             </w:r>
             <w:r>
               <w:rPr>
@@ -815,10 +836,12 @@
               <w:tab w:val="right" w:leader="dot" w:pos="9628"/>
             </w:tabs>
             <w:rPr>
+              <w:rFonts w:asciiTheme="minorHAnsi" w:eastAsiaTheme="minorEastAsia" w:hAnsiTheme="minorHAnsi"/>
               <w:noProof/>
+              <w:sz w:val="22"/>
             </w:rPr>
           </w:pPr>
-          <w:hyperlink w:anchor="_Toc238498246" w:history="1">
+          <w:hyperlink w:anchor="_Toc238500417" w:history="1">
             <w:r>
               <w:rPr>
                 <w:rStyle w:val="Hyperlink"/>
@@ -846,7 +869,7 @@
                 <w:noProof/>
                 <w:webHidden/>
               </w:rPr>
-              <w:instrText xml:space="preserve"> PAGEREF _Toc238498246 \h </w:instrText>
+              <w:instrText xml:space="preserve"> PAGEREF _Toc238500417 \h </w:instrText>
             </w:r>
             <w:r>
               <w:rPr>
@@ -866,7 +889,7 @@
                 <w:noProof/>
                 <w:webHidden/>
               </w:rPr>
-              <w:t>6</w:t>
+              <w:t>7</w:t>
             </w:r>
             <w:r>
               <w:rPr>
@@ -884,10 +907,12 @@
               <w:tab w:val="right" w:leader="dot" w:pos="9628"/>
             </w:tabs>
             <w:rPr>
+              <w:rFonts w:asciiTheme="minorHAnsi" w:eastAsiaTheme="minorEastAsia" w:hAnsiTheme="minorHAnsi"/>
               <w:noProof/>
+              <w:sz w:val="22"/>
             </w:rPr>
           </w:pPr>
-          <w:hyperlink w:anchor="_Toc238498247" w:history="1">
+          <w:hyperlink w:anchor="_Toc238500418" w:history="1">
             <w:r>
               <w:rPr>
                 <w:rStyle w:val="Hyperlink"/>
@@ -915,7 +940,7 @@
                 <w:noProof/>
                 <w:webHidden/>
               </w:rPr>
-              <w:instrText xml:space="preserve"> PAGEREF _Toc238498247 \h </w:instrText>
+              <w:instrText xml:space="preserve"> PAGEREF _Toc238500418 \h </w:instrText>
             </w:r>
             <w:r>
               <w:rPr>
@@ -935,7 +960,7 @@
                 <w:noProof/>
                 <w:webHidden/>
               </w:rPr>
-              <w:t>7</w:t>
+              <w:t>8</w:t>
             </w:r>
             <w:r>
               <w:rPr>
@@ -953,10 +978,12 @@
               <w:tab w:val="right" w:leader="dot" w:pos="9628"/>
             </w:tabs>
             <w:rPr>
+              <w:rFonts w:asciiTheme="minorHAnsi" w:eastAsiaTheme="minorEastAsia" w:hAnsiTheme="minorHAnsi"/>
               <w:noProof/>
+              <w:sz w:val="22"/>
             </w:rPr>
           </w:pPr>
-          <w:hyperlink w:anchor="_Toc238498248" w:history="1">
+          <w:hyperlink w:anchor="_Toc238500419" w:history="1">
             <w:r>
               <w:rPr>
                 <w:rStyle w:val="Hyperlink"/>
@@ -984,7 +1011,7 @@
                 <w:noProof/>
                 <w:webHidden/>
               </w:rPr>
-              <w:instrText xml:space="preserve"> PAGEREF _Toc238498248 \h </w:instrText>
+              <w:instrText xml:space="preserve"> PAGEREF _Toc238500419 \h </w:instrText>
             </w:r>
             <w:r>
               <w:rPr>
@@ -1004,7 +1031,7 @@
                 <w:noProof/>
                 <w:webHidden/>
               </w:rPr>
-              <w:t>7</w:t>
+              <w:t>8</w:t>
             </w:r>
             <w:r>
               <w:rPr>
@@ -1022,10 +1049,12 @@
               <w:tab w:val="right" w:leader="dot" w:pos="9628"/>
             </w:tabs>
             <w:rPr>
+              <w:rFonts w:asciiTheme="minorHAnsi" w:eastAsiaTheme="minorEastAsia" w:hAnsiTheme="minorHAnsi"/>
               <w:noProof/>
+              <w:sz w:val="22"/>
             </w:rPr>
           </w:pPr>
-          <w:hyperlink w:anchor="_Toc238498249" w:history="1">
+          <w:hyperlink w:anchor="_Toc238500420" w:history="1">
             <w:r>
               <w:rPr>
                 <w:rStyle w:val="Hyperlink"/>
@@ -1053,7 +1082,7 @@
                 <w:noProof/>
                 <w:webHidden/>
               </w:rPr>
-              <w:instrText xml:space="preserve"> PAGEREF _Toc238498249 \h </w:instrText>
+              <w:instrText xml:space="preserve"> PAGEREF _Toc238500420 \h </w:instrText>
             </w:r>
             <w:r>
               <w:rPr>
@@ -1073,7 +1102,7 @@
                 <w:noProof/>
                 <w:webHidden/>
               </w:rPr>
-              <w:t>7</w:t>
+              <w:t>8</w:t>
             </w:r>
             <w:r>
               <w:rPr>
@@ -1091,10 +1120,12 @@
               <w:tab w:val="right" w:leader="dot" w:pos="9628"/>
             </w:tabs>
             <w:rPr>
+              <w:rFonts w:asciiTheme="minorHAnsi" w:eastAsiaTheme="minorEastAsia" w:hAnsiTheme="minorHAnsi"/>
               <w:noProof/>
+              <w:sz w:val="22"/>
             </w:rPr>
           </w:pPr>
-          <w:hyperlink w:anchor="_Toc238498250" w:history="1">
+          <w:hyperlink w:anchor="_Toc238500421" w:history="1">
             <w:r>
               <w:rPr>
                 <w:rStyle w:val="Hyperlink"/>
@@ -1122,7 +1153,7 @@
                 <w:noProof/>
                 <w:webHidden/>
               </w:rPr>
-              <w:instrText xml:space="preserve"> PAGEREF _Toc238498250 \h </w:instrText>
+              <w:instrText xml:space="preserve"> PAGEREF _Toc238500421 \h </w:instrText>
             </w:r>
             <w:r>
               <w:rPr>
@@ -1142,7 +1173,7 @@
                 <w:noProof/>
                 <w:webHidden/>
               </w:rPr>
-              <w:t>8</w:t>
+              <w:t>9</w:t>
             </w:r>
             <w:r>
               <w:rPr>
@@ -1160,10 +1191,12 @@
               <w:tab w:val="right" w:leader="dot" w:pos="9628"/>
             </w:tabs>
             <w:rPr>
+              <w:rFonts w:asciiTheme="minorHAnsi" w:eastAsiaTheme="minorEastAsia" w:hAnsiTheme="minorHAnsi"/>
               <w:noProof/>
+              <w:sz w:val="22"/>
             </w:rPr>
           </w:pPr>
-          <w:hyperlink w:anchor="_Toc238498251" w:history="1">
+          <w:hyperlink w:anchor="_Toc238500422" w:history="1">
             <w:r>
               <w:rPr>
                 <w:rStyle w:val="Hyperlink"/>
@@ -1191,7 +1224,7 @@
                 <w:noProof/>
                 <w:webHidden/>
               </w:rPr>
-              <w:instrText xml:space="preserve"> PAGEREF _Toc238498251 \h </w:instrText>
+              <w:instrText xml:space="preserve"> PAGEREF _Toc238500422 \h </w:instrText>
             </w:r>
             <w:r>
               <w:rPr>
@@ -1211,7 +1244,7 @@
                 <w:noProof/>
                 <w:webHidden/>
               </w:rPr>
-              <w:t>8</w:t>
+              <w:t>9</w:t>
             </w:r>
             <w:r>
               <w:rPr>
@@ -1229,10 +1262,12 @@
               <w:tab w:val="right" w:leader="dot" w:pos="9628"/>
             </w:tabs>
             <w:rPr>
+              <w:rFonts w:asciiTheme="minorHAnsi" w:eastAsiaTheme="minorEastAsia" w:hAnsiTheme="minorHAnsi"/>
               <w:noProof/>
+              <w:sz w:val="22"/>
             </w:rPr>
           </w:pPr>
-          <w:hyperlink w:anchor="_Toc238498252" w:history="1">
+          <w:hyperlink w:anchor="_Toc238500423" w:history="1">
             <w:r>
               <w:rPr>
                 <w:rStyle w:val="Hyperlink"/>
@@ -1260,7 +1295,7 @@
                 <w:noProof/>
                 <w:webHidden/>
               </w:rPr>
-              <w:instrText xml:space="preserve"> PAGEREF _Toc238498252 \h </w:instrText>
+              <w:instrText xml:space="preserve"> PAGEREF _Toc238500423 \h </w:instrText>
             </w:r>
             <w:r>
               <w:rPr>
@@ -1280,7 +1315,7 @@
                 <w:noProof/>
                 <w:webHidden/>
               </w:rPr>
-              <w:t>9</w:t>
+              <w:t>10</w:t>
             </w:r>
             <w:r>
               <w:rPr>
@@ -1298,10 +1333,12 @@
               <w:tab w:val="right" w:leader="dot" w:pos="9628"/>
             </w:tabs>
             <w:rPr>
+              <w:rFonts w:asciiTheme="minorHAnsi" w:eastAsiaTheme="minorEastAsia" w:hAnsiTheme="minorHAnsi"/>
               <w:noProof/>
+              <w:sz w:val="22"/>
             </w:rPr>
           </w:pPr>
-          <w:hyperlink w:anchor="_Toc238498253" w:history="1">
+          <w:hyperlink w:anchor="_Toc238500424" w:history="1">
             <w:r>
               <w:rPr>
                 <w:rStyle w:val="Hyperlink"/>
@@ -1329,7 +1366,7 @@
                 <w:noProof/>
                 <w:webHidden/>
               </w:rPr>
-              <w:instrText xml:space="preserve"> PAGEREF _Toc238498253 \h </w:instrText>
+              <w:instrText xml:space="preserve"> PAGEREF _Toc238500424 \h </w:instrText>
             </w:r>
             <w:r>
               <w:rPr>
@@ -1349,7 +1386,7 @@
                 <w:noProof/>
                 <w:webHidden/>
               </w:rPr>
-              <w:t>9</w:t>
+              <w:t>10</w:t>
             </w:r>
             <w:r>
               <w:rPr>
@@ -1367,10 +1404,12 @@
               <w:tab w:val="right" w:leader="dot" w:pos="9628"/>
             </w:tabs>
             <w:rPr>
+              <w:rFonts w:asciiTheme="minorHAnsi" w:eastAsiaTheme="minorEastAsia" w:hAnsiTheme="minorHAnsi"/>
               <w:noProof/>
+              <w:sz w:val="22"/>
             </w:rPr>
           </w:pPr>
-          <w:hyperlink w:anchor="_Toc238498254" w:history="1">
+          <w:hyperlink w:anchor="_Toc238500425" w:history="1">
             <w:r>
               <w:rPr>
                 <w:rStyle w:val="Hyperlink"/>
@@ -1398,7 +1437,7 @@
                 <w:noProof/>
                 <w:webHidden/>
               </w:rPr>
-              <w:instrText xml:space="preserve"> PAGEREF _Toc238498254 \h </w:instrText>
+              <w:instrText xml:space="preserve"> PAGEREF _Toc238500425 \h </w:instrText>
             </w:r>
             <w:r>
               <w:rPr>
@@ -1418,7 +1457,7 @@
                 <w:noProof/>
                 <w:webHidden/>
               </w:rPr>
-              <w:t>9</w:t>
+              <w:t>10</w:t>
             </w:r>
             <w:r>
               <w:rPr>
@@ -1436,10 +1475,12 @@
               <w:tab w:val="right" w:leader="dot" w:pos="9628"/>
             </w:tabs>
             <w:rPr>
+              <w:rFonts w:asciiTheme="minorHAnsi" w:eastAsiaTheme="minorEastAsia" w:hAnsiTheme="minorHAnsi"/>
               <w:noProof/>
+              <w:sz w:val="22"/>
             </w:rPr>
           </w:pPr>
-          <w:hyperlink w:anchor="_Toc238498255" w:history="1">
+          <w:hyperlink w:anchor="_Toc238500426" w:history="1">
             <w:r>
               <w:rPr>
                 <w:rStyle w:val="Hyperlink"/>
@@ -1467,7 +1508,7 @@
                 <w:noProof/>
                 <w:webHidden/>
               </w:rPr>
-              <w:instrText xml:space="preserve"> PAGEREF _Toc238498255 \h </w:instrText>
+              <w:instrText xml:space="preserve"> PAGEREF _Toc238500426 \h </w:instrText>
             </w:r>
             <w:r>
               <w:rPr>
@@ -1487,7 +1528,7 @@
                 <w:noProof/>
                 <w:webHidden/>
               </w:rPr>
-              <w:t>9</w:t>
+              <w:t>10</w:t>
             </w:r>
             <w:r>
               <w:rPr>
@@ -1505,10 +1546,12 @@
               <w:tab w:val="right" w:leader="dot" w:pos="9628"/>
             </w:tabs>
             <w:rPr>
+              <w:rFonts w:asciiTheme="minorHAnsi" w:eastAsiaTheme="minorEastAsia" w:hAnsiTheme="minorHAnsi"/>
               <w:noProof/>
+              <w:sz w:val="22"/>
             </w:rPr>
           </w:pPr>
-          <w:hyperlink w:anchor="_Toc238498256" w:history="1">
+          <w:hyperlink w:anchor="_Toc238500427" w:history="1">
             <w:r>
               <w:rPr>
                 <w:rStyle w:val="Hyperlink"/>
@@ -1536,7 +1579,7 @@
                 <w:noProof/>
                 <w:webHidden/>
               </w:rPr>
-              <w:instrText xml:space="preserve"> PAGEREF _Toc238498256 \h </w:instrText>
+              <w:instrText xml:space="preserve"> PAGEREF _Toc238500427 \h </w:instrText>
             </w:r>
             <w:r>
               <w:rPr>
@@ -1556,7 +1599,7 @@
                 <w:noProof/>
                 <w:webHidden/>
               </w:rPr>
-              <w:t>10</w:t>
+              <w:t>11</w:t>
             </w:r>
             <w:r>
               <w:rPr>
@@ -1574,10 +1617,12 @@
               <w:tab w:val="right" w:leader="dot" w:pos="9628"/>
             </w:tabs>
             <w:rPr>
+              <w:rFonts w:asciiTheme="minorHAnsi" w:eastAsiaTheme="minorEastAsia" w:hAnsiTheme="minorHAnsi"/>
               <w:noProof/>
+              <w:sz w:val="22"/>
             </w:rPr>
           </w:pPr>
-          <w:hyperlink w:anchor="_Toc238498257" w:history="1">
+          <w:hyperlink w:anchor="_Toc238500428" w:history="1">
             <w:r>
               <w:rPr>
                 <w:rStyle w:val="Hyperlink"/>
@@ -1605,7 +1650,7 @@
                 <w:noProof/>
                 <w:webHidden/>
               </w:rPr>
-              <w:instrText xml:space="preserve"> PAGEREF _Toc238498257 \h </w:instrText>
+              <w:instrText xml:space="preserve"> PAGEREF _Toc238500428 \h </w:instrText>
             </w:r>
             <w:r>
               <w:rPr>
@@ -1625,7 +1670,7 @@
                 <w:noProof/>
                 <w:webHidden/>
               </w:rPr>
-              <w:t>10</w:t>
+              <w:t>11</w:t>
             </w:r>
             <w:r>
               <w:rPr>
@@ -1643,10 +1688,12 @@
               <w:tab w:val="right" w:leader="dot" w:pos="9628"/>
             </w:tabs>
             <w:rPr>
+              <w:rFonts w:asciiTheme="minorHAnsi" w:eastAsiaTheme="minorEastAsia" w:hAnsiTheme="minorHAnsi"/>
               <w:noProof/>
+              <w:sz w:val="22"/>
             </w:rPr>
           </w:pPr>
-          <w:hyperlink w:anchor="_Toc238498258" w:history="1">
+          <w:hyperlink w:anchor="_Toc238500429" w:history="1">
             <w:r>
               <w:rPr>
                 <w:rStyle w:val="Hyperlink"/>
@@ -1674,7 +1721,7 @@
                 <w:noProof/>
                 <w:webHidden/>
               </w:rPr>
-              <w:instrText xml:space="preserve"> PAGEREF _Toc238498258 \h </w:instrText>
+              <w:instrText xml:space="preserve"> PAGEREF _Toc238500429 \h </w:instrText>
             </w:r>
             <w:r>
               <w:rPr>
@@ -1694,7 +1741,7 @@
                 <w:noProof/>
                 <w:webHidden/>
               </w:rPr>
-              <w:t>10</w:t>
+              <w:t>11</w:t>
             </w:r>
             <w:r>
               <w:rPr>
@@ -1712,10 +1759,12 @@
               <w:tab w:val="right" w:leader="dot" w:pos="9628"/>
             </w:tabs>
             <w:rPr>
+              <w:rFonts w:asciiTheme="minorHAnsi" w:eastAsiaTheme="minorEastAsia" w:hAnsiTheme="minorHAnsi"/>
               <w:noProof/>
+              <w:sz w:val="22"/>
             </w:rPr>
           </w:pPr>
-          <w:hyperlink w:anchor="_Toc238498259" w:history="1">
+          <w:hyperlink w:anchor="_Toc238500430" w:history="1">
             <w:r>
               <w:rPr>
                 <w:rStyle w:val="Hyperlink"/>
@@ -1743,7 +1792,7 @@
                 <w:noProof/>
                 <w:webHidden/>
               </w:rPr>
-              <w:instrText xml:space="preserve"> PAGEREF _Toc238498259 \h </w:instrText>
+              <w:instrText xml:space="preserve"> PAGEREF _Toc238500430 \h </w:instrText>
             </w:r>
             <w:r>
               <w:rPr>
@@ -1763,7 +1812,7 @@
                 <w:noProof/>
                 <w:webHidden/>
               </w:rPr>
-              <w:t>11</w:t>
+              <w:t>12</w:t>
             </w:r>
             <w:r>
               <w:rPr>
@@ -1781,10 +1830,12 @@
               <w:tab w:val="right" w:leader="dot" w:pos="9628"/>
             </w:tabs>
             <w:rPr>
+              <w:rFonts w:asciiTheme="minorHAnsi" w:eastAsiaTheme="minorEastAsia" w:hAnsiTheme="minorHAnsi"/>
               <w:noProof/>
+              <w:sz w:val="22"/>
             </w:rPr>
           </w:pPr>
-          <w:hyperlink w:anchor="_Toc238498260" w:history="1">
+          <w:hyperlink w:anchor="_Toc238500431" w:history="1">
             <w:r>
               <w:rPr>
                 <w:rStyle w:val="Hyperlink"/>
@@ -1812,7 +1863,7 @@
                 <w:noProof/>
                 <w:webHidden/>
               </w:rPr>
-              <w:instrText xml:space="preserve"> PAGEREF _Toc238498260 \h </w:instrText>
+              <w:instrText xml:space="preserve"> PAGEREF _Toc238500431 \h </w:instrText>
             </w:r>
             <w:r>
               <w:rPr>
@@ -1832,7 +1883,7 @@
                 <w:noProof/>
                 <w:webHidden/>
               </w:rPr>
-              <w:t>11</w:t>
+              <w:t>12</w:t>
             </w:r>
             <w:r>
               <w:rPr>
@@ -1850,10 +1901,12 @@
               <w:tab w:val="right" w:leader="dot" w:pos="9628"/>
             </w:tabs>
             <w:rPr>
+              <w:rFonts w:asciiTheme="minorHAnsi" w:eastAsiaTheme="minorEastAsia" w:hAnsiTheme="minorHAnsi"/>
               <w:noProof/>
+              <w:sz w:val="22"/>
             </w:rPr>
           </w:pPr>
-          <w:hyperlink w:anchor="_Toc238498261" w:history="1">
+          <w:hyperlink w:anchor="_Toc238500432" w:history="1">
             <w:r>
               <w:rPr>
                 <w:rStyle w:val="Hyperlink"/>
@@ -1881,7 +1934,7 @@
                 <w:noProof/>
                 <w:webHidden/>
               </w:rPr>
-              <w:instrText xml:space="preserve"> PAGEREF _Toc238498261 \h </w:instrText>
+              <w:instrText xml:space="preserve"> PAGEREF _Toc238500432 \h </w:instrText>
             </w:r>
             <w:r>
               <w:rPr>
@@ -1901,7 +1954,7 @@
                 <w:noProof/>
                 <w:webHidden/>
               </w:rPr>
-              <w:t>13</w:t>
+              <w:t>14</w:t>
             </w:r>
             <w:r>
               <w:rPr>
@@ -1919,10 +1972,12 @@
               <w:tab w:val="right" w:leader="dot" w:pos="9628"/>
             </w:tabs>
             <w:rPr>
+              <w:rFonts w:asciiTheme="minorHAnsi" w:eastAsiaTheme="minorEastAsia" w:hAnsiTheme="minorHAnsi"/>
               <w:noProof/>
+              <w:sz w:val="22"/>
             </w:rPr>
           </w:pPr>
-          <w:hyperlink w:anchor="_Toc238498262" w:history="1">
+          <w:hyperlink w:anchor="_Toc238500433" w:history="1">
             <w:r>
               <w:rPr>
                 <w:rStyle w:val="Hyperlink"/>
@@ -1950,7 +2005,7 @@
                 <w:noProof/>
                 <w:webHidden/>
               </w:rPr>
-              <w:instrText xml:space="preserve"> PAGEREF _Toc238498262 \h </w:instrText>
+              <w:instrText xml:space="preserve"> PAGEREF _Toc238500433 \h </w:instrText>
             </w:r>
             <w:r>
               <w:rPr>
@@ -1970,7 +2025,7 @@
                 <w:noProof/>
                 <w:webHidden/>
               </w:rPr>
-              <w:t>16</w:t>
+              <w:t>17</w:t>
             </w:r>
             <w:r>
               <w:rPr>
@@ -1988,10 +2043,12 @@
               <w:tab w:val="right" w:leader="dot" w:pos="9628"/>
             </w:tabs>
             <w:rPr>
+              <w:rFonts w:asciiTheme="minorHAnsi" w:eastAsiaTheme="minorEastAsia" w:hAnsiTheme="minorHAnsi"/>
               <w:noProof/>
+              <w:sz w:val="22"/>
             </w:rPr>
           </w:pPr>
-          <w:hyperlink w:anchor="_Toc238498263" w:history="1">
+          <w:hyperlink w:anchor="_Toc238500434" w:history="1">
             <w:r>
               <w:rPr>
                 <w:rStyle w:val="Hyperlink"/>
@@ -2019,7 +2076,7 @@
                 <w:noProof/>
                 <w:webHidden/>
               </w:rPr>
-              <w:instrText xml:space="preserve"> PAGEREF _Toc238498263 \h </w:instrText>
+              <w:instrText xml:space="preserve"> PAGEREF _Toc238500434 \h </w:instrText>
             </w:r>
             <w:r>
               <w:rPr>
@@ -2039,7 +2096,7 @@
                 <w:noProof/>
                 <w:webHidden/>
               </w:rPr>
-              <w:t>16</w:t>
+              <w:t>17</w:t>
             </w:r>
             <w:r>
               <w:rPr>
@@ -2057,10 +2114,12 @@
               <w:tab w:val="right" w:leader="dot" w:pos="9628"/>
             </w:tabs>
             <w:rPr>
+              <w:rFonts w:asciiTheme="minorHAnsi" w:eastAsiaTheme="minorEastAsia" w:hAnsiTheme="minorHAnsi"/>
               <w:noProof/>
+              <w:sz w:val="22"/>
             </w:rPr>
           </w:pPr>
-          <w:hyperlink w:anchor="_Toc238498264" w:history="1">
+          <w:hyperlink w:anchor="_Toc238500435" w:history="1">
             <w:r>
               <w:rPr>
                 <w:rStyle w:val="Hyperlink"/>
@@ -2088,7 +2147,7 @@
                 <w:noProof/>
                 <w:webHidden/>
               </w:rPr>
-              <w:instrText xml:space="preserve"> PAGEREF _Toc238498264 \h </w:instrText>
+              <w:instrText xml:space="preserve"> PAGEREF _Toc238500435 \h </w:instrText>
             </w:r>
             <w:r>
               <w:rPr>
@@ -2108,7 +2167,7 @@
                 <w:noProof/>
                 <w:webHidden/>
               </w:rPr>
-              <w:t>18</w:t>
+              <w:t>19</w:t>
             </w:r>
             <w:r>
               <w:rPr>
@@ -2126,10 +2185,12 @@
               <w:tab w:val="right" w:leader="dot" w:pos="9628"/>
             </w:tabs>
             <w:rPr>
+              <w:rFonts w:asciiTheme="minorHAnsi" w:eastAsiaTheme="minorEastAsia" w:hAnsiTheme="minorHAnsi"/>
               <w:noProof/>
+              <w:sz w:val="22"/>
             </w:rPr>
           </w:pPr>
-          <w:hyperlink w:anchor="_Toc238498265" w:history="1">
+          <w:hyperlink w:anchor="_Toc238500436" w:history="1">
             <w:r>
               <w:rPr>
                 <w:rStyle w:val="Hyperlink"/>
@@ -2157,7 +2218,7 @@
                 <w:noProof/>
                 <w:webHidden/>
               </w:rPr>
-              <w:instrText xml:space="preserve"> PAGEREF _Toc238498265 \h </w:instrText>
+              <w:instrText xml:space="preserve"> PAGEREF _Toc238500436 \h </w:instrText>
             </w:r>
             <w:r>
               <w:rPr>
@@ -2177,7 +2238,7 @@
                 <w:noProof/>
                 <w:webHidden/>
               </w:rPr>
-              <w:t>22</w:t>
+              <w:t>23</w:t>
             </w:r>
             <w:r>
               <w:rPr>
@@ -2195,10 +2256,12 @@
               <w:tab w:val="right" w:leader="dot" w:pos="9628"/>
             </w:tabs>
             <w:rPr>
+              <w:rFonts w:asciiTheme="minorHAnsi" w:eastAsiaTheme="minorEastAsia" w:hAnsiTheme="minorHAnsi"/>
               <w:noProof/>
+              <w:sz w:val="22"/>
             </w:rPr>
           </w:pPr>
-          <w:hyperlink w:anchor="_Toc238498266" w:history="1">
+          <w:hyperlink w:anchor="_Toc238500437" w:history="1">
             <w:r>
               <w:rPr>
                 <w:rStyle w:val="Hyperlink"/>
@@ -2226,7 +2289,7 @@
                 <w:noProof/>
                 <w:webHidden/>
               </w:rPr>
-              <w:instrText xml:space="preserve"> PAGEREF _Toc238498266 \h </w:instrText>
+              <w:instrText xml:space="preserve"> PAGEREF _Toc238500437 \h </w:instrText>
             </w:r>
             <w:r>
               <w:rPr>
@@ -2246,7 +2309,7 @@
                 <w:noProof/>
                 <w:webHidden/>
               </w:rPr>
-              <w:t>22</w:t>
+              <w:t>23</w:t>
             </w:r>
             <w:r>
               <w:rPr>
@@ -2264,10 +2327,12 @@
               <w:tab w:val="right" w:leader="dot" w:pos="9628"/>
             </w:tabs>
             <w:rPr>
+              <w:rFonts w:asciiTheme="minorHAnsi" w:eastAsiaTheme="minorEastAsia" w:hAnsiTheme="minorHAnsi"/>
               <w:noProof/>
+              <w:sz w:val="22"/>
             </w:rPr>
           </w:pPr>
-          <w:hyperlink w:anchor="_Toc238498267" w:history="1">
+          <w:hyperlink w:anchor="_Toc238500438" w:history="1">
             <w:r>
               <w:rPr>
                 <w:rStyle w:val="Hyperlink"/>
@@ -2295,7 +2360,7 @@
                 <w:noProof/>
                 <w:webHidden/>
               </w:rPr>
-              <w:instrText xml:space="preserve"> PAGEREF _Toc238498267 \h </w:instrText>
+              <w:instrText xml:space="preserve"> PAGEREF _Toc238500438 \h </w:instrText>
             </w:r>
             <w:r>
               <w:rPr>
@@ -2315,7 +2380,7 @@
                 <w:noProof/>
                 <w:webHidden/>
               </w:rPr>
-              <w:t>23</w:t>
+              <w:t>24</w:t>
             </w:r>
             <w:r>
               <w:rPr>
@@ -2333,10 +2398,12 @@
               <w:tab w:val="right" w:leader="dot" w:pos="9628"/>
             </w:tabs>
             <w:rPr>
+              <w:rFonts w:asciiTheme="minorHAnsi" w:eastAsiaTheme="minorEastAsia" w:hAnsiTheme="minorHAnsi"/>
               <w:noProof/>
+              <w:sz w:val="22"/>
             </w:rPr>
           </w:pPr>
-          <w:hyperlink w:anchor="_Toc238498268" w:history="1">
+          <w:hyperlink w:anchor="_Toc238500439" w:history="1">
             <w:r>
               <w:rPr>
                 <w:rStyle w:val="Hyperlink"/>
@@ -2364,7 +2431,7 @@
                 <w:noProof/>
                 <w:webHidden/>
               </w:rPr>
-              <w:instrText xml:space="preserve"> PAGEREF _Toc238498268 \h </w:instrText>
+              <w:instrText xml:space="preserve"> PAGEREF _Toc238500439 \h </w:instrText>
             </w:r>
             <w:r>
               <w:rPr>
@@ -2384,7 +2451,7 @@
                 <w:noProof/>
                 <w:webHidden/>
               </w:rPr>
-              <w:t>23</w:t>
+              <w:t>24</w:t>
             </w:r>
             <w:r>
               <w:rPr>
@@ -2402,10 +2469,12 @@
               <w:tab w:val="right" w:leader="dot" w:pos="9628"/>
             </w:tabs>
             <w:rPr>
+              <w:rFonts w:asciiTheme="minorHAnsi" w:eastAsiaTheme="minorEastAsia" w:hAnsiTheme="minorHAnsi"/>
               <w:noProof/>
+              <w:sz w:val="22"/>
             </w:rPr>
           </w:pPr>
-          <w:hyperlink w:anchor="_Toc238498269" w:history="1">
+          <w:hyperlink w:anchor="_Toc238500440" w:history="1">
             <w:r>
               <w:rPr>
                 <w:rStyle w:val="Hyperlink"/>
@@ -2433,7 +2502,7 @@
                 <w:noProof/>
                 <w:webHidden/>
               </w:rPr>
-              <w:instrText xml:space="preserve"> PAGEREF _Toc238498269 \h </w:instrText>
+              <w:instrText xml:space="preserve"> PAGEREF _Toc238500440 \h </w:instrText>
             </w:r>
             <w:r>
               <w:rPr>
@@ -2453,7 +2522,7 @@
                 <w:noProof/>
                 <w:webHidden/>
               </w:rPr>
-              <w:t>24</w:t>
+              <w:t>26</w:t>
             </w:r>
             <w:r>
               <w:rPr>
@@ -2471,10 +2540,12 @@
               <w:tab w:val="right" w:leader="dot" w:pos="9628"/>
             </w:tabs>
             <w:rPr>
+              <w:rFonts w:asciiTheme="minorHAnsi" w:eastAsiaTheme="minorEastAsia" w:hAnsiTheme="minorHAnsi"/>
               <w:noProof/>
+              <w:sz w:val="22"/>
             </w:rPr>
           </w:pPr>
-          <w:hyperlink w:anchor="_Toc238498270" w:history="1">
+          <w:hyperlink w:anchor="_Toc238500441" w:history="1">
             <w:r>
               <w:rPr>
                 <w:rStyle w:val="Hyperlink"/>
@@ -2502,7 +2573,7 @@
                 <w:noProof/>
                 <w:webHidden/>
               </w:rPr>
-              <w:instrText xml:space="preserve"> PAGEREF _Toc238498270 \h </w:instrText>
+              <w:instrText xml:space="preserve"> PAGEREF _Toc238500441 \h </w:instrText>
             </w:r>
             <w:r>
               <w:rPr>
@@ -2522,7 +2593,7 @@
                 <w:noProof/>
                 <w:webHidden/>
               </w:rPr>
-              <w:t>24</w:t>
+              <w:t>26</w:t>
             </w:r>
             <w:r>
               <w:rPr>
@@ -2540,10 +2611,12 @@
               <w:tab w:val="right" w:leader="dot" w:pos="9628"/>
             </w:tabs>
             <w:rPr>
+              <w:rFonts w:asciiTheme="minorHAnsi" w:eastAsiaTheme="minorEastAsia" w:hAnsiTheme="minorHAnsi"/>
               <w:noProof/>
+              <w:sz w:val="22"/>
             </w:rPr>
           </w:pPr>
-          <w:hyperlink w:anchor="_Toc238498271" w:history="1">
+          <w:hyperlink w:anchor="_Toc238500442" w:history="1">
             <w:r>
               <w:rPr>
                 <w:rStyle w:val="Hyperlink"/>
@@ -2571,7 +2644,7 @@
                 <w:noProof/>
                 <w:webHidden/>
               </w:rPr>
-              <w:instrText xml:space="preserve"> PAGEREF _Toc238498271 \h </w:instrText>
+              <w:instrText xml:space="preserve"> PAGEREF _Toc238500442 \h </w:instrText>
             </w:r>
             <w:r>
               <w:rPr>
@@ -2591,7 +2664,7 @@
                 <w:noProof/>
                 <w:webHidden/>
               </w:rPr>
-              <w:t>26</w:t>
+              <w:t>28</w:t>
             </w:r>
             <w:r>
               <w:rPr>
@@ -2609,10 +2682,12 @@
               <w:tab w:val="right" w:leader="dot" w:pos="9628"/>
             </w:tabs>
             <w:rPr>
+              <w:rFonts w:asciiTheme="minorHAnsi" w:eastAsiaTheme="minorEastAsia" w:hAnsiTheme="minorHAnsi"/>
               <w:noProof/>
+              <w:sz w:val="22"/>
             </w:rPr>
           </w:pPr>
-          <w:hyperlink w:anchor="_Toc238498272" w:history="1">
+          <w:hyperlink w:anchor="_Toc238500443" w:history="1">
             <w:r>
               <w:rPr>
                 <w:rStyle w:val="Hyperlink"/>
@@ -2640,7 +2715,7 @@
                 <w:noProof/>
                 <w:webHidden/>
               </w:rPr>
-              <w:instrText xml:space="preserve"> PAGEREF _Toc238498272 \h </w:instrText>
+              <w:instrText xml:space="preserve"> PAGEREF _Toc238500443 \h </w:instrText>
             </w:r>
             <w:r>
               <w:rPr>
@@ -2660,7 +2735,7 @@
                 <w:noProof/>
                 <w:webHidden/>
               </w:rPr>
-              <w:t>27</w:t>
+              <w:t>29</w:t>
             </w:r>
             <w:r>
               <w:rPr>
@@ -2678,10 +2753,12 @@
               <w:tab w:val="right" w:leader="dot" w:pos="9628"/>
             </w:tabs>
             <w:rPr>
+              <w:rFonts w:asciiTheme="minorHAnsi" w:eastAsiaTheme="minorEastAsia" w:hAnsiTheme="minorHAnsi"/>
               <w:noProof/>
+              <w:sz w:val="22"/>
             </w:rPr>
           </w:pPr>
-          <w:hyperlink w:anchor="_Toc238498273" w:history="1">
+          <w:hyperlink w:anchor="_Toc238500444" w:history="1">
             <w:r>
               <w:rPr>
                 <w:rStyle w:val="Hyperlink"/>
@@ -2709,7 +2786,7 @@
                 <w:noProof/>
                 <w:webHidden/>
               </w:rPr>
-              <w:instrText xml:space="preserve"> PAGEREF _Toc238498273 \h </w:instrText>
+              <w:instrText xml:space="preserve"> PAGEREF _Toc238500444 \h </w:instrText>
             </w:r>
             <w:r>
               <w:rPr>
@@ -2729,7 +2806,7 @@
                 <w:noProof/>
                 <w:webHidden/>
               </w:rPr>
-              <w:t>27</w:t>
+              <w:t>29</w:t>
             </w:r>
             <w:r>
               <w:rPr>
@@ -2747,10 +2824,12 @@
               <w:tab w:val="right" w:leader="dot" w:pos="9628"/>
             </w:tabs>
             <w:rPr>
+              <w:rFonts w:asciiTheme="minorHAnsi" w:eastAsiaTheme="minorEastAsia" w:hAnsiTheme="minorHAnsi"/>
               <w:noProof/>
+              <w:sz w:val="22"/>
             </w:rPr>
           </w:pPr>
-          <w:hyperlink w:anchor="_Toc238498274" w:history="1">
+          <w:hyperlink w:anchor="_Toc238500445" w:history="1">
             <w:r>
               <w:rPr>
                 <w:rStyle w:val="Hyperlink"/>
@@ -2778,7 +2857,7 @@
                 <w:noProof/>
                 <w:webHidden/>
               </w:rPr>
-              <w:instrText xml:space="preserve"> PAGEREF _Toc238498274 \h </w:instrText>
+              <w:instrText xml:space="preserve"> PAGEREF _Toc238500445 \h </w:instrText>
             </w:r>
             <w:r>
               <w:rPr>
@@ -2798,7 +2877,7 @@
                 <w:noProof/>
                 <w:webHidden/>
               </w:rPr>
-              <w:t>28</w:t>
+              <w:t>30</w:t>
             </w:r>
             <w:r>
               <w:rPr>
@@ -2816,10 +2895,12 @@
               <w:tab w:val="right" w:leader="dot" w:pos="9628"/>
             </w:tabs>
             <w:rPr>
+              <w:rFonts w:asciiTheme="minorHAnsi" w:eastAsiaTheme="minorEastAsia" w:hAnsiTheme="minorHAnsi"/>
               <w:noProof/>
+              <w:sz w:val="22"/>
             </w:rPr>
           </w:pPr>
-          <w:hyperlink w:anchor="_Toc238498275" w:history="1">
+          <w:hyperlink w:anchor="_Toc238500446" w:history="1">
             <w:r>
               <w:rPr>
                 <w:rStyle w:val="Hyperlink"/>
@@ -2847,7 +2928,7 @@
                 <w:noProof/>
                 <w:webHidden/>
               </w:rPr>
-              <w:instrText xml:space="preserve"> PAGEREF _Toc238498275 \h </w:instrText>
+              <w:instrText xml:space="preserve"> PAGEREF _Toc238500446 \h </w:instrText>
             </w:r>
             <w:r>
               <w:rPr>
@@ -2867,7 +2948,7 @@
                 <w:noProof/>
                 <w:webHidden/>
               </w:rPr>
-              <w:t>29</w:t>
+              <w:t>31</w:t>
             </w:r>
             <w:r>
               <w:rPr>
@@ -2885,10 +2966,12 @@
               <w:tab w:val="right" w:leader="dot" w:pos="9628"/>
             </w:tabs>
             <w:rPr>
+              <w:rFonts w:asciiTheme="minorHAnsi" w:eastAsiaTheme="minorEastAsia" w:hAnsiTheme="minorHAnsi"/>
               <w:noProof/>
+              <w:sz w:val="22"/>
             </w:rPr>
           </w:pPr>
-          <w:hyperlink w:anchor="_Toc238498276" w:history="1">
+          <w:hyperlink w:anchor="_Toc238500447" w:history="1">
             <w:r>
               <w:rPr>
                 <w:rStyle w:val="Hyperlink"/>
@@ -2916,7 +2999,7 @@
                 <w:noProof/>
                 <w:webHidden/>
               </w:rPr>
-              <w:instrText xml:space="preserve"> PAGEREF _Toc238498276 \h </w:instrText>
+              <w:instrText xml:space="preserve"> PAGEREF _Toc238500447 \h </w:instrText>
             </w:r>
             <w:r>
               <w:rPr>
@@ -2936,7 +3019,7 @@
                 <w:noProof/>
                 <w:webHidden/>
               </w:rPr>
-              <w:t>30</w:t>
+              <w:t>32</w:t>
             </w:r>
             <w:r>
               <w:rPr>
@@ -2954,10 +3037,12 @@
               <w:tab w:val="right" w:leader="dot" w:pos="9628"/>
             </w:tabs>
             <w:rPr>
+              <w:rFonts w:asciiTheme="minorHAnsi" w:eastAsiaTheme="minorEastAsia" w:hAnsiTheme="minorHAnsi"/>
               <w:noProof/>
+              <w:sz w:val="22"/>
             </w:rPr>
           </w:pPr>
-          <w:hyperlink w:anchor="_Toc238498277" w:history="1">
+          <w:hyperlink w:anchor="_Toc238500448" w:history="1">
             <w:r>
               <w:rPr>
                 <w:rStyle w:val="Hyperlink"/>
@@ -2985,7 +3070,7 @@
                 <w:noProof/>
                 <w:webHidden/>
               </w:rPr>
-              <w:instrText xml:space="preserve"> PAGEREF _Toc238498277 \h </w:instrText>
+              <w:instrText xml:space="preserve"> PAGEREF _Toc238500448 \h </w:instrText>
             </w:r>
             <w:r>
               <w:rPr>
@@ -3005,7 +3090,7 @@
                 <w:noProof/>
                 <w:webHidden/>
               </w:rPr>
-              <w:t>31</w:t>
+              <w:t>33</w:t>
             </w:r>
             <w:r>
               <w:rPr>
@@ -3023,10 +3108,12 @@
               <w:tab w:val="right" w:leader="dot" w:pos="9628"/>
             </w:tabs>
             <w:rPr>
+              <w:rFonts w:asciiTheme="minorHAnsi" w:eastAsiaTheme="minorEastAsia" w:hAnsiTheme="minorHAnsi"/>
               <w:noProof/>
+              <w:sz w:val="22"/>
             </w:rPr>
           </w:pPr>
-          <w:hyperlink w:anchor="_Toc238498278" w:history="1">
+          <w:hyperlink w:anchor="_Toc238500449" w:history="1">
             <w:r>
               <w:rPr>
                 <w:rStyle w:val="Hyperlink"/>
@@ -3054,7 +3141,7 @@
                 <w:noProof/>
                 <w:webHidden/>
               </w:rPr>
-              <w:instrText xml:space="preserve"> PAGEREF _Toc238498278 \h </w:instrText>
+              <w:instrText xml:space="preserve"> PAGEREF _Toc238500449 \h </w:instrText>
             </w:r>
             <w:r>
               <w:rPr>
@@ -3074,7 +3161,7 @@
                 <w:noProof/>
                 <w:webHidden/>
               </w:rPr>
-              <w:t>31</w:t>
+              <w:t>33</w:t>
             </w:r>
             <w:r>
               <w:rPr>
@@ -3092,10 +3179,12 @@
               <w:tab w:val="right" w:leader="dot" w:pos="9628"/>
             </w:tabs>
             <w:rPr>
+              <w:rFonts w:asciiTheme="minorHAnsi" w:eastAsiaTheme="minorEastAsia" w:hAnsiTheme="minorHAnsi"/>
               <w:noProof/>
+              <w:sz w:val="22"/>
             </w:rPr>
           </w:pPr>
-          <w:hyperlink w:anchor="_Toc238498279" w:history="1">
+          <w:hyperlink w:anchor="_Toc238500450" w:history="1">
             <w:r>
               <w:rPr>
                 <w:rStyle w:val="Hyperlink"/>
@@ -3123,7 +3212,7 @@
                 <w:noProof/>
                 <w:webHidden/>
               </w:rPr>
-              <w:instrText xml:space="preserve"> PAGEREF _Toc238498279 \h </w:instrText>
+              <w:instrText xml:space="preserve"> PAGEREF _Toc238500450 \h </w:instrText>
             </w:r>
             <w:r>
               <w:rPr>
@@ -3143,7 +3232,7 @@
                 <w:noProof/>
                 <w:webHidden/>
               </w:rPr>
-              <w:t>31</w:t>
+              <w:t>33</w:t>
             </w:r>
             <w:r>
               <w:rPr>
@@ -3167,8 +3256,6 @@
       </w:sdtContent>
     </w:sdt>
     <w:p>
-      <w:bookmarkStart w:id="0" w:name="_GoBack"/>
-      <w:bookmarkEnd w:id="0"/>
       <w:r>
         <w:br w:type="page"/>
       </w:r>
@@ -3177,7 +3264,7 @@
       <w:pPr>
         <w:pStyle w:val="Heading1"/>
       </w:pPr>
-      <w:bookmarkStart w:id="1" w:name="_Toc238498237"/>
+      <w:bookmarkStart w:id="1" w:name="_Toc238500408"/>
       <w:r>
         <w:lastRenderedPageBreak/>
         <w:t>1. Introduction</w:t>
@@ -3192,30 +3279,15 @@
         <w:rPr>
           <w:b/>
         </w:rPr>
-        <w:t>Real-world Problem → Data → Representation</w:t>
-      </w:r>
-      <w:r>
-        <w:rPr>
-          <w:b/>
-        </w:rPr>
-        <w:t xml:space="preserve"> → Traditional Machine Learning → Controlled Experiments → Final Model → Intelligent Application</w:t>
-      </w:r>
-      <w:r>
-        <w:t xml:space="preserve">. The first system maps six patient measurements to an educational class prediction. The second maps eleven property attributes to an estimated listed price in </w:t>
-      </w:r>
-      <w:r>
-        <w:t>billion VND.</w:t>
+        <w:t>Real-world Problem → Data → Representation → Traditional Machine Learning → Controlled Experiments → Final Model → Intelligent Application</w:t>
+      </w:r>
+      <w:r>
+        <w:t>. The first system maps six patient measurements to an educational class prediction. The second maps eleven property attributes to an estimated listed price in billion VND.</w:t>
       </w:r>
     </w:p>
     <w:p>
       <w:r>
-        <w:t>The assignment objective is broader than obtaining a high metric. It examines how raw observations are represented, how invalid or missing fields are handled, how several traditional model families respond to the same representation, and how c</w:t>
-      </w:r>
-      <w:r>
-        <w:t>ontrolled experiments support a defensible final choice. A held-out test set is reserved for evaluation, while cross-validation on training data is used for configuration selection. The selected preprocessing and estimator are then saved together as a scik</w:t>
-      </w:r>
-      <w:r>
-        <w:t xml:space="preserve">it-learn </w:t>
+        <w:t xml:space="preserve">The assignment objective is broader than obtaining a high metric. It examines how raw observations are represented, how invalid or missing fields are handled, how several traditional model families respond to the same representation, and how controlled experiments support a defensible final choice. A held-out test set is reserved for evaluation, while cross-validation on training data is used for configuration selection. The selected preprocessing and estimator are then saved together as a scikit-learn </w:t>
       </w:r>
       <w:r>
         <w:rPr>
@@ -3230,10 +3302,7 @@
     </w:p>
     <w:p>
       <w:r>
-        <w:t xml:space="preserve">The application layer consists of a FastAPI backend, a React/Vite web client, an Expo React Native mobile client, and a Neo4j knowledge graph for </w:t>
-      </w:r>
-      <w:r>
-        <w:t xml:space="preserve">the Diabetes model. The deployed topology uses Render for the API, Vercel for the web client, Neo4j AuraDB for the graph, and Expo Go for mobile demonstration. These are educational prediction systems: the Diabetes output is </w:t>
+        <w:t xml:space="preserve">The application layer consists of a FastAPI backend, a React/Vite web client, an Expo React Native mobile client, and a Neo4j knowledge graph for the Diabetes model. The deployed topology uses Render for the API, Vercel for the web client, Neo4j AuraDB for the graph, and Expo Go for mobile demonstration. These are educational prediction systems: the Diabetes output is </w:t>
       </w:r>
       <w:r>
         <w:rPr>
@@ -3242,10 +3311,7 @@
         <w:t>not a medical diagnosis</w:t>
       </w:r>
       <w:r>
-        <w:t>, and th</w:t>
-      </w:r>
-      <w:r>
-        <w:t>e house-price output is not a professional valuation.</w:t>
+        <w:t>, and the house-price output is not a professional valuation.</w:t>
       </w:r>
     </w:p>
     <w:p>
@@ -3258,7 +3324,7 @@
           <w:noProof/>
         </w:rPr>
         <w:drawing>
-          <wp:inline distT="0" distB="0" distL="0" distR="0">
+          <wp:inline distT="0" distB="0" distL="0" distR="0" wp14:anchorId="561BA664" wp14:editId="7DCB36BF">
             <wp:extent cx="5715000" cy="3659245"/>
             <wp:effectExtent l="0" t="0" r="0" b="0"/>
             <wp:docPr id="1" name="Picture 1"/>
@@ -3309,7 +3375,7 @@
       <w:pPr>
         <w:pStyle w:val="Heading1"/>
       </w:pPr>
-      <w:bookmarkStart w:id="2" w:name="_Toc238498238"/>
+      <w:bookmarkStart w:id="2" w:name="_Toc238500409"/>
       <w:r>
         <w:lastRenderedPageBreak/>
         <w:t>2. Intelligent System Definition</w:t>
@@ -3318,10 +3384,7 @@
     </w:p>
     <w:p>
       <w:r>
-        <w:t xml:space="preserve">An intelligent system in this assignment combines a learned model with the </w:t>
-      </w:r>
-      <w:r>
-        <w:t xml:space="preserve">data representation, preprocessing, evaluation process, inference contract, and user-facing software required to apply the model consistently. It is therefore more than a call to </w:t>
+        <w:t xml:space="preserve">An intelligent system in this assignment combines a learned model with the data representation, preprocessing, evaluation process, inference contract, and user-facing software required to apply the model consistently. It is therefore more than a call to </w:t>
       </w:r>
       <w:r>
         <w:rPr>
@@ -3331,10 +3394,7 @@
         <w:t>model.fit()</w:t>
       </w:r>
       <w:r>
-        <w:t>. The learned estimator is valuable only when its input meaning is</w:t>
-      </w:r>
-      <w:r>
-        <w:t xml:space="preserve"> explicit and the same fitted transformations are used at inference time.</w:t>
+        <w:t>. The learned estimator is valuable only when its input meaning is explicit and the same fitted transformations are used at inference time.</w:t>
       </w:r>
     </w:p>
     <w:p>
@@ -3681,7 +3741,7 @@
       <w:pPr>
         <w:pStyle w:val="Heading2"/>
       </w:pPr>
-      <w:bookmarkStart w:id="3" w:name="_Toc238498239"/>
+      <w:bookmarkStart w:id="3" w:name="_Toc238500410"/>
       <w:r>
         <w:t>2.1 Diabetes Classification System</w:t>
       </w:r>
@@ -3689,10 +3749,7 @@
     </w:p>
     <w:p>
       <w:r>
-        <w:t>The Di</w:t>
-      </w:r>
-      <w:r>
-        <w:t xml:space="preserve">abetes system receives </w:t>
+        <w:t xml:space="preserve">The Diabetes system receives </w:t>
       </w:r>
       <w:r>
         <w:rPr>
@@ -3762,17 +3819,14 @@
         <w:t>Outcome</w:t>
       </w:r>
       <w:r>
-        <w:t>, where 0 is labelled Non-diabetic and 1 is labelled Diabetic. The class and probability describe the fitte</w:t>
-      </w:r>
-      <w:r>
-        <w:t>d assignment model; they have not been clinically validated and must not be treated as diagnosis, screening guidance, or a medical decision.</w:t>
+        <w:t>, where 0 is labelled Non-diabetic and 1 is labelled Diabetic. The class and probability describe the fitted assignment model; they have not been clinically validated and must not be treated as diagnosis, screening guidance, or a medical decision.</w:t>
       </w:r>
     </w:p>
     <w:p>
       <w:pPr>
         <w:pStyle w:val="Heading2"/>
       </w:pPr>
-      <w:bookmarkStart w:id="4" w:name="_Toc238498240"/>
+      <w:bookmarkStart w:id="4" w:name="_Toc238500411"/>
       <w:r>
         <w:t>2.2 Vietnam House Price Prediction System</w:t>
       </w:r>
@@ -3787,14 +3841,7 @@
           <w:rFonts w:ascii="Consolas" w:hAnsi="Consolas"/>
           <w:sz w:val="20"/>
         </w:rPr>
-        <w:t>Pr</w:t>
-      </w:r>
-      <w:r>
-        <w:rPr>
-          <w:rFonts w:ascii="Consolas" w:hAnsi="Consolas"/>
-          <w:sz w:val="20"/>
-        </w:rPr>
-        <w:t>ovince</w:t>
+        <w:t>Province</w:t>
       </w:r>
       <w:r>
         <w:t xml:space="preserve">, </w:t>
@@ -3907,17 +3954,14 @@
         <w:t>Price</w:t>
       </w:r>
       <w:r>
-        <w:t xml:space="preserve"> target in billion VND. The prediction represents a learned association with 2024 listin</w:t>
-      </w:r>
-      <w:r>
-        <w:t>g prices, not a transaction guarantee or certified appraisal.</w:t>
+        <w:t xml:space="preserve"> target in billion VND. The prediction represents a learned association with 2024 listing prices, not a transaction guarantee or certified appraisal.</w:t>
       </w:r>
     </w:p>
     <w:p>
       <w:pPr>
         <w:pStyle w:val="Heading1"/>
       </w:pPr>
-      <w:bookmarkStart w:id="5" w:name="_Toc238498241"/>
+      <w:bookmarkStart w:id="5" w:name="_Toc238500412"/>
       <w:r>
         <w:t>3. Problem Formulation</w:t>
       </w:r>
@@ -3927,7 +3971,7 @@
       <w:pPr>
         <w:pStyle w:val="Heading2"/>
       </w:pPr>
-      <w:bookmarkStart w:id="6" w:name="_Toc238498242"/>
+      <w:bookmarkStart w:id="6" w:name="_Toc238500413"/>
       <w:r>
         <w:t>3.1 Classification Problem</w:t>
       </w:r>
@@ -3935,29 +3979,20 @@
     </w:p>
     <w:p>
       <w:r>
-        <w:t>For patient observation *i*, the selected raw vector is xᵢ ∈ ℝ⁶ and the target is yᵢ ∈ {0,1}. The classifier learns a function ŷ = fθ(x) from hi</w:t>
-      </w:r>
-      <w:r>
-        <w:t>storical labelled observations. Evaluation focuses on the positive class and reports Accuracy, Precision, Recall, F1-score, and a confusion matrix. Accuracy measures the overall correct fraction, Precision measures the purity of positive predictions, Recal</w:t>
-      </w:r>
-      <w:r>
-        <w:t>l measures the fraction of actual positives recovered, and F1 is the harmonic mean of Precision and Recall.</w:t>
+        <w:t>For patient observation *i*, the selected raw vector is xᵢ ∈ ℝ⁶ and the target is yᵢ ∈ {0,1}. The classifier learns a function ŷ = fθ(x) from historical labelled observations. Evaluation focuses on the positive class and reports Accuracy, Precision, Recall, F1-score, and a confusion matrix. Accuracy measures the overall correct fraction, Precision measures the purity of positive predictions, Recall measures the fraction of actual positives recovered, and F1 is the harmonic mean of Precision and Recall.</w:t>
       </w:r>
     </w:p>
     <w:p>
       <w:r>
         <w:lastRenderedPageBreak/>
-        <w:t xml:space="preserve">The classification classes are imbalanced: 500 observations (65.1%) have Outcome 0 and 268 (34.9%) have Outcome 1. This motivates reporting metrics </w:t>
-      </w:r>
-      <w:r>
-        <w:t>beyond Accuracy. A majority-class rule can appear acceptable by Accuracy while failing to detect every positive case.</w:t>
+        <w:t>The classification classes are imbalanced: 500 observations (65.1%) have Outcome 0 and 268 (34.9%) have Outcome 1. This motivates reporting metrics beyond Accuracy. A majority-class rule can appear acceptable by Accuracy while failing to detect every positive case.</w:t>
       </w:r>
     </w:p>
     <w:p>
       <w:pPr>
         <w:pStyle w:val="Heading2"/>
       </w:pPr>
-      <w:bookmarkStart w:id="7" w:name="_Toc238498243"/>
+      <w:bookmarkStart w:id="7" w:name="_Toc238500414"/>
       <w:r>
         <w:t>3.2 Regression Problem</w:t>
       </w:r>
@@ -3975,10 +4010,7 @@
         <w:t>Price</w:t>
       </w:r>
       <w:r>
-        <w:t xml:space="preserve"> in billion VND. The regressor learns ŷ = fθ(x). Evaluation uses MAE, MSE, RMSE, R², and MAPE. Lower MAE, MSE, RMSE, and MAPE are better; higher R² is better. RMSE and MAE remain in interpretable price units except that MSE is expressed in squared billion-</w:t>
-      </w:r>
-      <w:r>
-        <w:t>VND units.</w:t>
+        <w:t xml:space="preserve"> in billion VND. The regressor learns ŷ = fθ(x). Evaluation uses MAE, MSE, RMSE, R², and MAPE. Lower MAE, MSE, RMSE, and MAPE are better; higher R² is better. RMSE and MAE remain in interpretable price units except that MSE is expressed in squared billion-VND units.</w:t>
       </w:r>
     </w:p>
     <w:p>
@@ -3995,7 +4027,7 @@
       <w:pPr>
         <w:pStyle w:val="Heading1"/>
       </w:pPr>
-      <w:bookmarkStart w:id="8" w:name="_Toc238498244"/>
+      <w:bookmarkStart w:id="8" w:name="_Toc238500415"/>
       <w:r>
         <w:lastRenderedPageBreak/>
         <w:t>4. Dataset</w:t>
@@ -4006,7 +4038,7 @@
       <w:pPr>
         <w:pStyle w:val="Heading2"/>
       </w:pPr>
-      <w:bookmarkStart w:id="9" w:name="_Toc238498245"/>
+      <w:bookmarkStart w:id="9" w:name="_Toc238500416"/>
       <w:r>
         <w:t>4.1 Diabetes Dataset</w:t>
       </w:r>
@@ -4059,13 +4091,7 @@
     </w:p>
     <w:p>
       <w:r>
-        <w:t>The target contains 500 class-0 and 268 class-1 observa</w:t>
-      </w:r>
-      <w:r>
-        <w:t>tions. Glucose shows the strongest absolute linear correlation with Outcome among the selected six attributes (0.4947), followed by BMI (0.3137), Age (0.2384), Pregnancies (0.2219), DiabetesPedigreeFunction (0.1738), and BloodPressure (0.1706). These corre</w:t>
-      </w:r>
-      <w:r>
-        <w:t>lations are descriptive and do not establish causality.</w:t>
+        <w:t>The target contains 500 class-0 and 268 class-1 observations. Glucose shows the strongest absolute linear correlation with Outcome among the selected six attributes (0.4947), followed by BMI (0.3137), Age (0.2384), Pregnancies (0.2219), DiabetesPedigreeFunction (0.1738), and BloodPressure (0.1706). These correlations are descriptive and do not establish causality.</w:t>
       </w:r>
     </w:p>
     <w:p>
@@ -4600,10 +4626,7 @@
         <w:t>Pregnancies = 0</w:t>
       </w:r>
       <w:r>
-        <w:t xml:space="preserve"> is retained because zero pregnancies is meaningful. SkinThickness and Insulin are not selected for the final six-feature representation because their missing-measurement rates are high and the controlled representation experiment did not improve with them</w:t>
-      </w:r>
-      <w:r>
-        <w:t xml:space="preserve">. This does </w:t>
+        <w:t xml:space="preserve"> is retained because zero pregnancies is meaningful. SkinThickness and Insulin are not selected for the final six-feature representation because their missing-measurement rates are high and the controlled representation experiment did not improve with them. This does </w:t>
       </w:r>
       <w:r>
         <w:rPr>
@@ -4619,7 +4642,7 @@
       <w:pPr>
         <w:pStyle w:val="Heading2"/>
       </w:pPr>
-      <w:bookmarkStart w:id="10" w:name="_Toc238498246"/>
+      <w:bookmarkStart w:id="10" w:name="_Toc238500417"/>
       <w:r>
         <w:t>4.2 Vietnam Housing Dataset 2024</w:t>
       </w:r>
@@ -4637,10 +4660,7 @@
         <w:t>data/house_price/vietnam_housing_dataset.csv</w:t>
       </w:r>
       <w:r>
-        <w:t>, identified as the Kaggle Vietnam Housing Dataset 2024. It contains 30,229 rows and 12 ori</w:t>
-      </w:r>
-      <w:r>
-        <w:t xml:space="preserve">ginal columns. The eleven candidate inputs are Address, Area, Frontage, Access Road, House direction, Balcony direction, Floors, Bedrooms, Bathrooms, Legal status, and Furniture state; the target is </w:t>
+        <w:t xml:space="preserve">, identified as the Kaggle Vietnam Housing Dataset 2024. It contains 30,229 rows and 12 original columns. The eleven candidate inputs are Address, Area, Frontage, Access Road, House direction, Balcony direction, Floors, Bedrooms, Bathrooms, Legal status, and Furniture state; the target is </w:t>
       </w:r>
       <w:r>
         <w:rPr>
@@ -4659,10 +4679,7 @@
         <w:keepNext/>
       </w:pPr>
       <w:r>
-        <w:t>Table 3. Vietnam housing dataset sc</w:t>
-      </w:r>
-      <w:r>
-        <w:t>hema and observed ranges.</w:t>
+        <w:t>Table 3. Vietnam housing dataset schema and observed ranges.</w:t>
       </w:r>
     </w:p>
     <w:tbl>
@@ -5573,13 +5590,7 @@
               <w:rPr>
                 <w:sz w:val="19"/>
               </w:rPr>
-              <w:t xml:space="preserve">2 </w:t>
-            </w:r>
-            <w:r>
-              <w:rPr>
-                <w:sz w:val="19"/>
-              </w:rPr>
-              <w:t>observed categories</w:t>
+              <w:t>2 observed categories</w:t>
             </w:r>
           </w:p>
         </w:tc>
@@ -5783,10 +5794,7 @@
         <w:keepNext/>
       </w:pPr>
       <w:r>
-        <w:t>Table 4. House-price target and concentra</w:t>
-      </w:r>
-      <w:r>
-        <w:t>tion statistics.</w:t>
+        <w:t>Table 4. House-price target and concentration statistics.</w:t>
       </w:r>
     </w:p>
     <w:tbl>
@@ -6202,12 +6210,9 @@
       <w:pPr>
         <w:pStyle w:val="Heading1"/>
       </w:pPr>
-      <w:bookmarkStart w:id="11" w:name="_Toc238498247"/>
-      <w:r>
-        <w:t xml:space="preserve">5. </w:t>
-      </w:r>
-      <w:r>
-        <w:t>Data Representation</w:t>
+      <w:bookmarkStart w:id="11" w:name="_Toc238500418"/>
+      <w:r>
+        <w:t>5. Data Representation</w:t>
       </w:r>
       <w:bookmarkEnd w:id="11"/>
     </w:p>
@@ -6215,7 +6220,7 @@
       <w:pPr>
         <w:pStyle w:val="Heading2"/>
       </w:pPr>
-      <w:bookmarkStart w:id="12" w:name="_Toc238498248"/>
+      <w:bookmarkStart w:id="12" w:name="_Toc238500419"/>
       <w:r>
         <w:t>5.1 Diabetes Representation</w:t>
       </w:r>
@@ -6233,25 +6238,19 @@
         <w:t>[Pregnancies, Glucose, BloodPressure, BMI, DiabetesPedigreeFunction, Age]</w:t>
       </w:r>
       <w:r>
-        <w:t>. Before splitting, invalid zeros in Glucose, BloodPressure,</w:t>
-      </w:r>
-      <w:r>
-        <w:t xml:space="preserve"> SkinThickness, Insulin, and BMI are represented as missing values. For the final six-feature vector, this affects Glucose, BloodPressure, and BMI. Median values and scaling parameters are learned only within the fitted Pipeline.</w:t>
+        <w:t>. Before splitting, invalid zeros in Glucose, BloodPressure, SkinThickness, Insulin, and BMI are represented as missing values. For the final six-feature vector, this affects Glucose, BloodPressure, and BMI. Median values and scaling parameters are learned only within the fitted Pipeline.</w:t>
       </w:r>
     </w:p>
     <w:p>
       <w:r>
-        <w:t>The representation is deli</w:t>
-      </w:r>
-      <w:r>
-        <w:t>berately compact. The six-versus-eight-feature experiment holds the classifier and evaluation procedure constant, allowing the effect of adding SkinThickness and Insulin to be measured rather than assumed.</w:t>
+        <w:t>The representation is deliberately compact. The six-versus-eight-feature experiment holds the classifier and evaluation procedure constant, allowing the effect of adding SkinThickness and Insulin to be measured rather than assumed.</w:t>
       </w:r>
     </w:p>
     <w:p>
       <w:pPr>
         <w:pStyle w:val="Heading2"/>
       </w:pPr>
-      <w:bookmarkStart w:id="13" w:name="_Toc238498249"/>
+      <w:bookmarkStart w:id="13" w:name="_Toc238500420"/>
       <w:r>
         <w:t>5.2 House Price Representation</w:t>
       </w:r>
@@ -6259,10 +6258,7 @@
     </w:p>
     <w:p>
       <w:r>
-        <w:t>The compact six-fea</w:t>
-      </w:r>
-      <w:r>
-        <w:t xml:space="preserve">ture experiment begins with </w:t>
+        <w:t xml:space="preserve">The compact six-feature experiment begins with </w:t>
       </w:r>
       <w:r>
         <w:rPr>
@@ -6322,10 +6318,7 @@
         <w:t>Legal status</w:t>
       </w:r>
       <w:r>
-        <w:t>. Experiment 3 then evaluates all eleven usable raw fields and selects them for the final system: Province, Area, Frontage, Access Road, House direction, Balcony direc</w:t>
-      </w:r>
-      <w:r>
-        <w:t>tion, Floors, Bedrooms, Bathrooms, Legal status, and Furniture state. Address itself is excluded because its 10,265 text strings would create excessive cardinality and a fragile interface contract.</w:t>
+        <w:t>. Experiment 3 then evaluates all eleven usable raw fields and selects them for the final system: Province, Area, Frontage, Access Road, House direction, Balcony direction, Floors, Bedrooms, Bathrooms, Legal status, and Furniture state. Address itself is excluded because its 10,265 text strings would create excessive cardinality and a fragile interface contract.</w:t>
       </w:r>
     </w:p>
     <w:p>
@@ -6339,10 +6332,7 @@
         <w:t>raw feature</w:t>
       </w:r>
       <w:r>
-        <w:t xml:space="preserve"> is an interpretable field supplied by a user</w:t>
-      </w:r>
-      <w:r>
-        <w:t xml:space="preserve"> or dataset row. An </w:t>
+        <w:t xml:space="preserve"> is an interpretable field supplied by a user or dataset row. An </w:t>
       </w:r>
       <w:r>
         <w:rPr>
@@ -6370,17 +6360,14 @@
         <w:t>final numerical vector</w:t>
       </w:r>
       <w:r>
-        <w:t xml:space="preserve"> is the complete transformed matrix after imputation, scaling, and one-hot encoding. Therefore, raw feature ≠ encoded fea</w:t>
-      </w:r>
-      <w:r>
-        <w:t>ture ≠ final numerical vector.</w:t>
+        <w:t xml:space="preserve"> is the complete transformed matrix after imputation, scaling, and one-hot encoding. Therefore, raw feature ≠ encoded feature ≠ final numerical vector.</w:t>
       </w:r>
     </w:p>
     <w:p>
       <w:pPr>
         <w:pStyle w:val="Heading1"/>
       </w:pPr>
-      <w:bookmarkStart w:id="14" w:name="_Toc238498250"/>
+      <w:bookmarkStart w:id="14" w:name="_Toc238500421"/>
       <w:r>
         <w:lastRenderedPageBreak/>
         <w:t>6. Exploratory Data Analysis</w:t>
@@ -6389,31 +6376,19 @@
     </w:p>
     <w:p>
       <w:r>
-        <w:t>Diabetes EDA confirms the 65.1%/34.9% target imbalance and exposes the hidden-zero issue. After invalid zeros are replaced by missing values, Glucose has 763 valid measurements, mean 121.69, media</w:t>
-      </w:r>
-      <w:r>
-        <w:t>n 117, and skewness 0.531. BMI has 757 valid measurements, mean 32.46, median 32.30, and skewness 0.594. Age ranges from 21 to 81 years and is right-skewed (1.13), while valid BloodPressure has mean 72.41 and median 72. These findings motivate robust media</w:t>
-      </w:r>
-      <w:r>
-        <w:t>n imputation rather than dropping rows.</w:t>
+        <w:t>Diabetes EDA confirms the 65.1%/34.9% target imbalance and exposes the hidden-zero issue. After invalid zeros are replaced by missing values, Glucose has 763 valid measurements, mean 121.69, median 117, and skewness 0.531. BMI has 757 valid measurements, mean 32.46, median 32.30, and skewness 0.594. Age ranges from 21 to 81 years and is right-skewed (1.13), while valid BloodPressure has mean 72.41 and median 72. These findings motivate robust median imputation rather than dropping rows.</w:t>
       </w:r>
     </w:p>
     <w:p>
       <w:r>
-        <w:t>House-price EDA shows that Price is nearly symmetric on its original scale: its mean and median are close and skewness is -0.0290. Consequently, the notebook does not introduce a logarithmic target transformation. Ar</w:t>
-      </w:r>
-      <w:r>
-        <w:t>ea is strongly right-skewed (3.8885), with a long tail up to 595 m²; large positive areas are retained because they may represent valid listings. Floors have a median of 3 and range from 1 to 10. The geographic distribution is strongly concentrated in Hồ C</w:t>
-      </w:r>
-      <w:r>
-        <w:t>hí Minh and Hà Nội, so evaluation for sparsely represented provinces remains uncertain.</w:t>
+        <w:t>House-price EDA shows that Price is nearly symmetric on its original scale: its mean and median are close and skewness is -0.0290. Consequently, the notebook does not introduce a logarithmic target transformation. Area is strongly right-skewed (3.8885), with a long tail up to 595 m²; large positive areas are retained because they may represent valid listings. Floors have a median of 3 and range from 1 to 10. The geographic distribution is strongly concentrated in Hồ Chí Minh and Hà Nội, so evaluation for sparsely represented provinces remains uncertain.</w:t>
       </w:r>
     </w:p>
     <w:p>
       <w:pPr>
         <w:pStyle w:val="Heading1"/>
       </w:pPr>
-      <w:bookmarkStart w:id="15" w:name="_Toc238498251"/>
+      <w:bookmarkStart w:id="15" w:name="_Toc238500422"/>
       <w:r>
         <w:t>7. Data Preprocessing</w:t>
       </w:r>
@@ -6428,14 +6403,7 @@
           <w:rFonts w:ascii="Consolas" w:hAnsi="Consolas"/>
           <w:sz w:val="20"/>
         </w:rPr>
-        <w:t>Sim</w:t>
-      </w:r>
-      <w:r>
-        <w:rPr>
-          <w:rFonts w:ascii="Consolas" w:hAnsi="Consolas"/>
-          <w:sz w:val="20"/>
-        </w:rPr>
-        <w:t>pleImputer(strategy="median")</w:t>
+        <w:t>SimpleImputer(strategy="median")</w:t>
       </w:r>
       <w:r>
         <w:t xml:space="preserve">, </w:t>
@@ -6448,10 +6416,7 @@
         <w:t>StandardScaler</w:t>
       </w:r>
       <w:r>
-        <w:t xml:space="preserve">, and the classifier. Although tree ensembles do not require scaling in the same way as distance- or margin-based models, the common preprocessing keeps the experimental interface consistent and is stored with </w:t>
-      </w:r>
-      <w:r>
-        <w:t>the fitted estimator.</w:t>
+        <w:t>, and the classifier. Although tree ensembles do not require scaling in the same way as distance- or margin-based models, the common preprocessing keeps the experimental interface consistent and is stored with the fitted estimator.</w:t>
       </w:r>
     </w:p>
     <w:p>
@@ -6483,14 +6448,7 @@
           <w:rFonts w:ascii="Consolas" w:hAnsi="Consolas"/>
           <w:sz w:val="20"/>
         </w:rPr>
-        <w:t>OneHot</w:t>
-      </w:r>
-      <w:r>
-        <w:rPr>
-          <w:rFonts w:ascii="Consolas" w:hAnsi="Consolas"/>
-          <w:sz w:val="20"/>
-        </w:rPr>
-        <w:t>Encoder(handle_unknown="ignore")</w:t>
+        <w:t>OneHotEncoder(handle_unknown="ignore")</w:t>
       </w:r>
       <w:r>
         <w:t xml:space="preserve">. No </w:t>
@@ -6508,10 +6466,7 @@
     </w:p>
     <w:p>
       <w:r>
-        <w:t>Preprocessing occurs ins</w:t>
-      </w:r>
-      <w:r>
-        <w:t>ide each model Pipeline and therefore inside each cross-validation fold. This prevents medians, modes, scales, and category information from being learned from validation or test observations.</w:t>
+        <w:t>Preprocessing occurs inside each model Pipeline and therefore inside each cross-validation fold. This prevents medians, modes, scales, and category information from being learned from validation or test observations.</w:t>
       </w:r>
     </w:p>
     <w:p>
@@ -6523,7 +6478,7 @@
       <w:pPr>
         <w:pStyle w:val="Heading1"/>
       </w:pPr>
-      <w:bookmarkStart w:id="16" w:name="_Toc238498252"/>
+      <w:bookmarkStart w:id="16" w:name="_Toc238500423"/>
       <w:r>
         <w:lastRenderedPageBreak/>
         <w:t>8. Traditional Machine Learning Models</w:t>
@@ -6534,21 +6489,15 @@
       <w:pPr>
         <w:pStyle w:val="Heading2"/>
       </w:pPr>
-      <w:bookmarkStart w:id="17" w:name="_Toc238498253"/>
-      <w:r>
-        <w:t>8.1 Classification Mod</w:t>
-      </w:r>
-      <w:r>
-        <w:t>els</w:t>
+      <w:bookmarkStart w:id="17" w:name="_Toc238500424"/>
+      <w:r>
+        <w:t>8.1 Classification Models</w:t>
       </w:r>
       <w:bookmarkEnd w:id="17"/>
     </w:p>
     <w:p>
       <w:r>
-        <w:t>Logistic Regression receives the standardized six-value vector and learns a linear log-odds boundary; regularization controls coefficient magnitude, offering interpretability but limiting nonlinear interactions. KNN receives the same standardized vecto</w:t>
-      </w:r>
-      <w:r>
-        <w:t xml:space="preserve">r and predicts from nearby training cases; </w:t>
+        <w:t xml:space="preserve">Logistic Regression receives the standardized six-value vector and learns a linear log-odds boundary; regularization controls coefficient magnitude, offering interpretability but limiting nonlinear interactions. KNN receives the same standardized vector and predicts from nearby training cases; </w:t>
       </w:r>
       <w:r>
         <w:rPr>
@@ -6558,10 +6507,7 @@
         <w:t>n_neighbors</w:t>
       </w:r>
       <w:r>
-        <w:t xml:space="preserve"> governs locality, while inference cost and sensitivity to scale are weaknesses. A Decision Tree learns axis-aligned split rules; depth and minimum-sample controls regulate complexity, but a single tree</w:t>
-      </w:r>
-      <w:r>
-        <w:t xml:space="preserve"> is unstable and can overfit.</w:t>
+        <w:t xml:space="preserve"> governs locality, while inference cost and sensitivity to scale are weaknesses. A Decision Tree learns axis-aligned split rules; depth and minimum-sample controls regulate complexity, but a single tree is unstable and can overfit.</w:t>
       </w:r>
     </w:p>
     <w:p>
@@ -6596,20 +6542,14 @@
         <w:t>random_state</w:t>
       </w:r>
       <w:r>
-        <w:t xml:space="preserve">; it models nonlinear interactions and is more stable than a single </w:t>
-      </w:r>
-      <w:r>
-        <w:t xml:space="preserve">tree, but its impurity importance is not causal and the ensemble is less transparent than a short tree. SVM learns a maximum-margin boundary, using its kernel and regularization settings to express nonlinear separation; it benefits from scaling but can be </w:t>
-      </w:r>
-      <w:r>
-        <w:t>sensitive to configuration and is less directly interpretable.</w:t>
+        <w:t>; it models nonlinear interactions and is more stable than a single tree, but its impurity importance is not causal and the ensemble is less transparent than a short tree. SVM learns a maximum-margin boundary, using its kernel and regularization settings to express nonlinear separation; it benefits from scaling but can be sensitive to configuration and is less directly interpretable.</w:t>
       </w:r>
     </w:p>
     <w:p>
       <w:pPr>
         <w:pStyle w:val="Heading2"/>
       </w:pPr>
-      <w:bookmarkStart w:id="18" w:name="_Toc238498254"/>
+      <w:bookmarkStart w:id="18" w:name="_Toc238500425"/>
       <w:r>
         <w:t>8.2 Regression Models</w:t>
       </w:r>
@@ -6617,10 +6557,7 @@
     </w:p>
     <w:p>
       <w:r>
-        <w:t xml:space="preserve">Linear Regression receives the one-hot/numerical representation and learns an additive linear relationship; it is simple but cannot directly express complex interactions. </w:t>
-      </w:r>
-      <w:r>
-        <w:t xml:space="preserve">KNN Regressor averages nearby transformed examples; </w:t>
+        <w:t xml:space="preserve">Linear Regression receives the one-hot/numerical representation and learns an additive linear relationship; it is simple but cannot directly express complex interactions. KNN Regressor averages nearby transformed examples; </w:t>
       </w:r>
       <w:r>
         <w:rPr>
@@ -6630,18 +6567,12 @@
         <w:t>n_neighbors</w:t>
       </w:r>
       <w:r>
-        <w:t xml:space="preserve"> controls smoothness, while high-dimensional one-hot space and prediction cost are limitations. Decision Tree Regressor partitions feature space into regions and predicts regional averages; unr</w:t>
-      </w:r>
-      <w:r>
-        <w:t>estricted depth can have high variance.</w:t>
+        <w:t xml:space="preserve"> controls smoothness, while high-dimensional one-hot space and prediction cost are limitations. Decision Tree Regressor partitions feature space into regions and predicts regional averages; unrestricted depth can have high variance.</w:t>
       </w:r>
     </w:p>
     <w:p>
       <w:r>
-        <w:t>Random Forest Regressor averages many regression trees. It handles nonlinear relationships and mixed transformed inputs, and provides model-specific impurity importance, but it can smooth extreme prices and cannot ex</w:t>
-      </w:r>
-      <w:r>
-        <w:t xml:space="preserve">trapolate reliably beyond learned patterns. SVR with an RBF kernel learns a nonlinear function within an epsilon-insensitive loss; kernel, </w:t>
+        <w:t xml:space="preserve">Random Forest Regressor averages many regression trees. It handles nonlinear relationships and mixed transformed inputs, and provides model-specific impurity importance, but it can smooth extreme prices and cannot extrapolate reliably beyond learned patterns. SVR with an RBF kernel learns a nonlinear function within an epsilon-insensitive loss; kernel, </w:t>
       </w:r>
       <w:r>
         <w:rPr>
@@ -6671,17 +6602,14 @@
         <w:t>epsilon</w:t>
       </w:r>
       <w:r>
-        <w:t xml:space="preserve"> influence flexibility. It achieved strong results here, though training cost and interpretabili</w:t>
-      </w:r>
-      <w:r>
-        <w:t>ty are less convenient than for the selected forest.</w:t>
+        <w:t xml:space="preserve"> influence flexibility. It achieved strong results here, though training cost and interpretability are less convenient than for the selected forest.</w:t>
       </w:r>
     </w:p>
     <w:p>
       <w:pPr>
         <w:pStyle w:val="Heading1"/>
       </w:pPr>
-      <w:bookmarkStart w:id="19" w:name="_Toc238498255"/>
+      <w:bookmarkStart w:id="19" w:name="_Toc238500426"/>
       <w:r>
         <w:t>9. Experimental Design</w:t>
       </w:r>
@@ -6699,17 +6627,14 @@
         <w:t>random_state=42</w:t>
       </w:r>
       <w:r>
-        <w:t>. Diabetes stratifies by Outcome, producing 614 training and 154 test observations. House Price produces 24,183 trai</w:t>
-      </w:r>
-      <w:r>
-        <w:t>ning and 6,046 test observations. The held-out test set is not used to select hyperparameters or feature representations.</w:t>
+        <w:t>. Diabetes stratifies by Outcome, producing 614 training and 154 test observations. House Price produces 24,183 training and 6,046 test observations. The held-out test set is not used to select hyperparameters or feature representations.</w:t>
       </w:r>
     </w:p>
     <w:p>
       <w:pPr>
         <w:pStyle w:val="Heading2"/>
       </w:pPr>
-      <w:bookmarkStart w:id="20" w:name="_Toc238498256"/>
+      <w:bookmarkStart w:id="20" w:name="_Toc238500427"/>
       <w:r>
         <w:lastRenderedPageBreak/>
         <w:t>9.1 Experiment 1 – Model Comparison</w:t>
@@ -6718,13 +6643,7 @@
     </w:p>
     <w:p>
       <w:r>
-        <w:t>Experiment 1 changes only the learning algorithm while preserving data, representation, preprocess</w:t>
-      </w:r>
-      <w:r>
-        <w:t xml:space="preserve">ing, and split conditions. The initial holdout tables provide descriptive comparisons. Training-only five-fold cross-validation then evaluates model stability and supports selection without repeatedly consulting the test set. Diabetes uses F1-score; House </w:t>
-      </w:r>
-      <w:r>
-        <w:t xml:space="preserve">Price uses RMSE with shuffled </w:t>
+        <w:t xml:space="preserve">Experiment 1 changes only the learning algorithm while preserving data, representation, preprocessing, and split conditions. The initial holdout tables provide descriptive comparisons. Training-only five-fold cross-validation then evaluates model stability and supports selection without repeatedly consulting the test set. Diabetes uses F1-score; House Price uses RMSE with shuffled </w:t>
       </w:r>
       <w:r>
         <w:rPr>
@@ -6741,7 +6660,7 @@
       <w:pPr>
         <w:pStyle w:val="Heading2"/>
       </w:pPr>
-      <w:bookmarkStart w:id="21" w:name="_Toc238498257"/>
+      <w:bookmarkStart w:id="21" w:name="_Toc238500428"/>
       <w:r>
         <w:t>9.2 Experiment 2 – Hyperparameter Investigation</w:t>
       </w:r>
@@ -6759,10 +6678,7 @@
         <w:t>max_depth</w:t>
       </w:r>
       <w:r>
-        <w:t xml:space="preserve"> across 2, 4, 6, 8, and unrestricted depth, using five-fold training CV and F1. The</w:t>
-      </w:r>
-      <w:r>
-        <w:t xml:space="preserve"> House experiment varies </w:t>
+        <w:t xml:space="preserve"> across 2, 4, 6, 8, and unrestricted depth, using five-fold training CV and F1. The House experiment varies </w:t>
       </w:r>
       <w:r>
         <w:rPr>
@@ -6799,7 +6715,7 @@
       <w:pPr>
         <w:pStyle w:val="Heading2"/>
       </w:pPr>
-      <w:bookmarkStart w:id="22" w:name="_Toc238498258"/>
+      <w:bookmarkStart w:id="22" w:name="_Toc238500429"/>
       <w:r>
         <w:t>9.3 Experiment 3 – Feature Representation</w:t>
       </w:r>
@@ -6807,13 +6723,7 @@
     </w:p>
     <w:p>
       <w:r>
-        <w:t>Diabetes compares the select</w:t>
-      </w:r>
-      <w:r>
-        <w:t>ed six raw features against all eight original inputs under the tuned forest and the same five folds. House Price compares the compact six-feature vector against all eleven usable raw fields under the depth-12 forest. Only the representation changes, isola</w:t>
-      </w:r>
-      <w:r>
-        <w:t>ting how information content and missingness affect performance.</w:t>
+        <w:t>Diabetes compares the selected six raw features against all eight original inputs under the tuned forest and the same five folds. House Price compares the compact six-feature vector against all eleven usable raw fields under the depth-12 forest. Only the representation changes, isolating how information content and missingness affect performance.</w:t>
       </w:r>
     </w:p>
     <w:p>
@@ -6825,7 +6735,7 @@
       <w:pPr>
         <w:pStyle w:val="Heading1"/>
       </w:pPr>
-      <w:bookmarkStart w:id="23" w:name="_Toc238498259"/>
+      <w:bookmarkStart w:id="23" w:name="_Toc238500430"/>
       <w:r>
         <w:lastRenderedPageBreak/>
         <w:t>10. Experimental Results</w:t>
@@ -6836,7 +6746,7 @@
       <w:pPr>
         <w:pStyle w:val="Heading2"/>
       </w:pPr>
-      <w:bookmarkStart w:id="24" w:name="_Toc238498260"/>
+      <w:bookmarkStart w:id="24" w:name="_Toc238500431"/>
       <w:r>
         <w:t>10.1 Diabetes Results</w:t>
       </w:r>
@@ -6854,10 +6764,7 @@
         <w:t>DummyClassifier(strategy="most_frequent")</w:t>
       </w:r>
       <w:r>
-        <w:t xml:space="preserve"> baseline predicts every held-out observation as class 0. It obtains Accuracy 0.6494 because 100 </w:t>
-      </w:r>
-      <w:r>
-        <w:t xml:space="preserve">of the 154 test observations are class 0, but Precision, Recall, and F1 for class 1 are all 0. Its confusion matrix is </w:t>
+        <w:t xml:space="preserve"> baseline predicts every held-out observation as class 0. It obtains Accuracy 0.6494 because 100 of the 154 test observations are class 0, but Precision, Recall, and F1 for class 1 are all 0. Its confusion matrix is </w:t>
       </w:r>
       <w:r>
         <w:rPr>
@@ -6876,10 +6783,7 @@
         <w:keepNext/>
       </w:pPr>
       <w:r>
-        <w:t>Table 5. Diabetes baseline and five-model holdout compa</w:t>
-      </w:r>
-      <w:r>
-        <w:t>rison.</w:t>
+        <w:t>Table 5. Diabetes baseline and five-model holdout comparison.</w:t>
       </w:r>
     </w:p>
     <w:tbl>
@@ -7615,10 +7519,7 @@
     </w:p>
     <w:p>
       <w:r>
-        <w:t xml:space="preserve">Random Forest is strongest on the initial holdout table. Training-only model comparison gives a different close ranking, with KNN first among the five original configurations. This difference reinforces why a single </w:t>
-      </w:r>
-      <w:r>
-        <w:t>holdout ranking should not become the sole selection rule.</w:t>
+        <w:t>Random Forest is strongest on the initial holdout table. Training-only model comparison gives a different close ranking, with KNN first among the five original configurations. This difference reinforces why a single holdout ranking should not become the sole selection rule.</w:t>
       </w:r>
     </w:p>
     <w:p>
@@ -8037,7 +7938,7 @@
           <w:noProof/>
         </w:rPr>
         <w:drawing>
-          <wp:inline distT="0" distB="0" distL="0" distR="0">
+          <wp:inline distT="0" distB="0" distL="0" distR="0" wp14:anchorId="78003738" wp14:editId="3B5346AC">
             <wp:extent cx="5715000" cy="3088338"/>
             <wp:effectExtent l="0" t="0" r="0" b="0"/>
             <wp:docPr id="2" name="Picture 2"/>
@@ -8385,7 +8286,7 @@
           <w:noProof/>
         </w:rPr>
         <w:drawing>
-          <wp:inline distT="0" distB="0" distL="0" distR="0">
+          <wp:inline distT="0" distB="0" distL="0" distR="0" wp14:anchorId="04CAFA8C" wp14:editId="79FA79F7">
             <wp:extent cx="5715000" cy="3542914"/>
             <wp:effectExtent l="0" t="0" r="0" b="0"/>
             <wp:docPr id="3" name="Picture 3"/>
@@ -8434,13 +8335,7 @@
     </w:p>
     <w:p>
       <w:r>
-        <w:t xml:space="preserve">Depth 6 gives the highest mean training CV F1, 0.6462. Depth 2 is too restrictive under these conditions; increasing depth beyond 6 does not improve </w:t>
-      </w:r>
-      <w:r>
-        <w:t>the mean. When depth 6 is fitted and evaluated on the held-out test set, F1 is 0.6061, below the unrestricted forest's initial holdout F1 of 0.6408. This is not an error: the depth was selected by average training-fold performance, and the holdout is a sep</w:t>
-      </w:r>
-      <w:r>
-        <w:t>arate finite sample. Returning to the test set to choose unrestricted depth would leak evaluation information into model selection.</w:t>
+        <w:t>Depth 6 gives the highest mean training CV F1, 0.6462. Depth 2 is too restrictive under these conditions; increasing depth beyond 6 does not improve the mean. When depth 6 is fitted and evaluated on the held-out test set, F1 is 0.6061, below the unrestricted forest's initial holdout F1 of 0.6408. This is not an error: the depth was selected by average training-fold performance, and the holdout is a separate finite sample. Returning to the test set to choose unrestricted depth would leak evaluation information into model selection.</w:t>
       </w:r>
     </w:p>
     <w:p>
@@ -8574,13 +8469,7 @@
               <w:rPr>
                 <w:sz w:val="19"/>
               </w:rPr>
-              <w:t>Selected repre</w:t>
-            </w:r>
-            <w:r>
-              <w:rPr>
-                <w:sz w:val="19"/>
-              </w:rPr>
-              <w:t>sentation</w:t>
+              <w:t>Selected representation</w:t>
             </w:r>
           </w:p>
         </w:tc>
@@ -8741,7 +8630,7 @@
         </w:rPr>
         <w:lastRenderedPageBreak/>
         <w:drawing>
-          <wp:inline distT="0" distB="0" distL="0" distR="0">
+          <wp:inline distT="0" distB="0" distL="0" distR="0" wp14:anchorId="1925DFE9" wp14:editId="5D0BA5C4">
             <wp:extent cx="5715000" cy="3535101"/>
             <wp:effectExtent l="0" t="0" r="0" b="0"/>
             <wp:docPr id="4" name="Picture 4"/>
@@ -8790,22 +8679,16 @@
     </w:p>
     <w:p>
       <w:r>
-        <w:t xml:space="preserve">Adding SkinThickness and Insulin neither improves mean F1 nor reduces variability under the controlled </w:t>
-      </w:r>
-      <w:r>
-        <w:t>procedure. More features are therefore not necessarily better. The result is specific to this dataset, missingness pattern, classifier, and validation design; it does not show that the two omitted measurements are intrinsically unimportant.</w:t>
+        <w:t>Adding SkinThickness and Insulin neither improves mean F1 nor reduces variability under the controlled procedure. More features are therefore not necessarily better. The result is specific to this dataset, missingness pattern, classifier, and validation design; it does not show that the two omitted measurements are intrinsically unimportant.</w:t>
       </w:r>
     </w:p>
     <w:p>
       <w:pPr>
         <w:pStyle w:val="Heading2"/>
       </w:pPr>
-      <w:bookmarkStart w:id="25" w:name="_Toc238498261"/>
-      <w:r>
-        <w:t>10.2 House Pric</w:t>
-      </w:r>
-      <w:r>
-        <w:t>e Results</w:t>
+      <w:bookmarkStart w:id="25" w:name="_Toc238500432"/>
+      <w:r>
+        <w:t>10.2 House Price Results</w:t>
       </w:r>
       <w:bookmarkEnd w:id="25"/>
     </w:p>
@@ -8830,10 +8713,7 @@
         <w:keepNext/>
       </w:pPr>
       <w:r>
-        <w:t>Table 9. House-price baseline an</w:t>
-      </w:r>
-      <w:r>
-        <w:t>d five-model holdout comparison.</w:t>
+        <w:t>Table 9. House-price baseline and five-model holdout comparison.</w:t>
       </w:r>
     </w:p>
     <w:tbl>
@@ -9714,7 +9594,7 @@
         </w:rPr>
         <w:lastRenderedPageBreak/>
         <w:drawing>
-          <wp:inline distT="0" distB="0" distL="0" distR="0">
+          <wp:inline distT="0" distB="0" distL="0" distR="0" wp14:anchorId="22E32BEB" wp14:editId="00189670">
             <wp:extent cx="5715000" cy="2163071"/>
             <wp:effectExtent l="0" t="0" r="0" b="0"/>
             <wp:docPr id="5" name="Picture 5"/>
@@ -9763,10 +9643,7 @@
     </w:p>
     <w:p>
       <w:r>
-        <w:t xml:space="preserve">SVR is strongest on the descriptive holdout comparison. Training-only </w:t>
-      </w:r>
-      <w:r>
-        <w:t>cross-validation confirms it as the strongest original configuration, with a small fold-to-fold spread.</w:t>
+        <w:t>SVR is strongest on the descriptive holdout comparison. Training-only cross-validation confirms it as the strongest original configuration, with a small fold-to-fold spread.</w:t>
       </w:r>
     </w:p>
     <w:p>
@@ -10186,7 +10063,7 @@
           <w:noProof/>
         </w:rPr>
         <w:drawing>
-          <wp:inline distT="0" distB="0" distL="0" distR="0">
+          <wp:inline distT="0" distB="0" distL="0" distR="0" wp14:anchorId="4A5005C7" wp14:editId="7AFA7AE2">
             <wp:extent cx="5715000" cy="3084841"/>
             <wp:effectExtent l="0" t="0" r="0" b="0"/>
             <wp:docPr id="6" name="Picture 6"/>
@@ -10318,14 +10195,7 @@
                 <w:b/>
                 <w:sz w:val="19"/>
               </w:rPr>
-              <w:t xml:space="preserve">Std CV </w:t>
-            </w:r>
-            <w:r>
-              <w:rPr>
-                <w:b/>
-                <w:sz w:val="19"/>
-              </w:rPr>
-              <w:t>RMSE</w:t>
+              <w:t>Std CV RMSE</w:t>
             </w:r>
           </w:p>
         </w:tc>
@@ -10657,7 +10527,7 @@
           <w:noProof/>
         </w:rPr>
         <w:drawing>
-          <wp:inline distT="0" distB="0" distL="0" distR="0">
+          <wp:inline distT="0" distB="0" distL="0" distR="0" wp14:anchorId="7649248A" wp14:editId="6F0BA676">
             <wp:extent cx="5715000" cy="3146894"/>
             <wp:effectExtent l="0" t="0" r="0" b="0"/>
             <wp:docPr id="7" name="Picture 7"/>
@@ -10706,10 +10576,7 @@
     </w:p>
     <w:p>
       <w:r>
-        <w:t xml:space="preserve">Depth 12 slightly improves upon the original SVR CV RMSE by 0.0039 </w:t>
-      </w:r>
-      <w:r>
-        <w:t>billion VND. The difference is small and should not be overstated. Depth 4 underfits under these conditions; deeper forests increase the observed CV RMSE and variability.</w:t>
+        <w:t>Depth 12 slightly improves upon the original SVR CV RMSE by 0.0039 billion VND. The difference is small and should not be overstated. Depth 4 underfits under these conditions; deeper forests increase the observed CV RMSE and variability.</w:t>
       </w:r>
     </w:p>
     <w:p>
@@ -10777,14 +10644,7 @@
                 <w:b/>
                 <w:sz w:val="19"/>
               </w:rPr>
-              <w:t>Raw fe</w:t>
-            </w:r>
-            <w:r>
-              <w:rPr>
-                <w:b/>
-                <w:sz w:val="19"/>
-              </w:rPr>
-              <w:t>atures</w:t>
+              <w:t>Raw features</w:t>
             </w:r>
           </w:p>
         </w:tc>
@@ -11010,7 +10870,7 @@
           <w:noProof/>
         </w:rPr>
         <w:drawing>
-          <wp:inline distT="0" distB="0" distL="0" distR="0">
+          <wp:inline distT="0" distB="0" distL="0" distR="0" wp14:anchorId="2CFDDF1A" wp14:editId="2264A105">
             <wp:extent cx="5715000" cy="3140252"/>
             <wp:effectExtent l="0" t="0" r="0" b="0"/>
             <wp:docPr id="8" name="Picture 8"/>
@@ -11060,22 +10920,16 @@
     <w:p>
       <w:r>
         <w:lastRenderedPageBreak/>
-        <w:t xml:space="preserve">Unlike Diabetes, the additional usable House Price </w:t>
-      </w:r>
-      <w:r>
-        <w:t>attributes improve the representation. Frontage, Access Road, both direction fields, and Furniture state reduce mean CV RMSE by approximately 0.0448 billion VND. Pipeline imputation allows their observed information to contribute without deleting rows.</w:t>
+        <w:t>Unlike Diabetes, the additional usable House Price attributes improve the representation. Frontage, Access Road, both direction fields, and Furniture state reduce mean CV RMSE by approximately 0.0448 billion VND. Pipeline imputation allows their observed information to contribute without deleting rows.</w:t>
       </w:r>
     </w:p>
     <w:p>
       <w:pPr>
         <w:pStyle w:val="Heading1"/>
       </w:pPr>
-      <w:bookmarkStart w:id="26" w:name="_Toc238498262"/>
-      <w:r>
-        <w:t>11.</w:t>
-      </w:r>
-      <w:r>
-        <w:t xml:space="preserve"> Final Model Selection</w:t>
+      <w:bookmarkStart w:id="26" w:name="_Toc238500433"/>
+      <w:r>
+        <w:t>11. Final Model Selection</w:t>
       </w:r>
       <w:bookmarkEnd w:id="26"/>
     </w:p>
@@ -11083,7 +10937,7 @@
       <w:pPr>
         <w:pStyle w:val="Heading2"/>
       </w:pPr>
-      <w:bookmarkStart w:id="27" w:name="_Toc238498263"/>
+      <w:bookmarkStart w:id="27" w:name="_Toc238500434"/>
       <w:r>
         <w:t>11.1 Diabetes Final Model</w:t>
       </w:r>
@@ -11111,10 +10965,7 @@
         <w:t>StandardScaler</w:t>
       </w:r>
       <w:r>
-        <w:t>, and the forest. Sele</w:t>
-      </w:r>
-      <w:r>
-        <w:t>ction is based on the best mean training CV F1 among tested depths and the better six-feature representation; the held-out test set is used once for final evaluation.</w:t>
+        <w:t>, and the forest. Selection is based on the best mean training CV F1 among tested depths and the better six-feature representation; the held-out test set is used once for final evaluation.</w:t>
       </w:r>
     </w:p>
     <w:p>
@@ -11375,10 +11226,7 @@
         <w:t>[[85, 15], [24, 30]]</w:t>
       </w:r>
       <w:r>
-        <w:t xml:space="preserve">: TN = 85, FP = 15, FN = 24, and TP = 30. A false negative is an actual class-1 observation classified as class 0; the 24 false negatives explain the limited recall </w:t>
-      </w:r>
-      <w:r>
-        <w:t>of 0.5556. These are educational classification errors, not clinical outcomes.</w:t>
+        <w:t>: TN = 85, FP = 15, FN = 24, and TP = 30. A false negative is an actual class-1 observation classified as class 0; the 24 false negatives explain the limited recall of 0.5556. These are educational classification errors, not clinical outcomes.</w:t>
       </w:r>
     </w:p>
     <w:p>
@@ -11392,7 +11240,7 @@
         </w:rPr>
         <w:lastRenderedPageBreak/>
         <w:drawing>
-          <wp:inline distT="0" distB="0" distL="0" distR="0">
+          <wp:inline distT="0" distB="0" distL="0" distR="0" wp14:anchorId="0981F59E" wp14:editId="59B855BC">
             <wp:extent cx="5715000" cy="4785591"/>
             <wp:effectExtent l="0" t="0" r="0" b="0"/>
             <wp:docPr id="9" name="Picture 9"/>
@@ -11441,10 +11289,7 @@
     </w:p>
     <w:p>
       <w:r>
-        <w:t>The model's impurity-based importance is highest for Glucose (0.4017), followed by BMI</w:t>
-      </w:r>
-      <w:r>
-        <w:t xml:space="preserve"> (0.1985), Age (0.1344), DiabetesPedigreeFunction (0.1244), Pregnancies (0.0767), and BloodPressure (0.0643). These values describe tree split usage in this fitted model and do not establish causal or clinical importance.</w:t>
+        <w:t>The model's impurity-based importance is highest for Glucose (0.4017), followed by BMI (0.1985), Age (0.1344), DiabetesPedigreeFunction (0.1244), Pregnancies (0.0767), and BloodPressure (0.0643). These values describe tree split usage in this fitted model and do not establish causal or clinical importance.</w:t>
       </w:r>
     </w:p>
     <w:p>
@@ -11458,7 +11303,7 @@
         </w:rPr>
         <w:lastRenderedPageBreak/>
         <w:drawing>
-          <wp:inline distT="0" distB="0" distL="0" distR="0">
+          <wp:inline distT="0" distB="0" distL="0" distR="0" wp14:anchorId="0FBDF500" wp14:editId="056CC377">
             <wp:extent cx="5715000" cy="3798541"/>
             <wp:effectExtent l="0" t="0" r="0" b="0"/>
             <wp:docPr id="10" name="Picture 10"/>
@@ -11502,20 +11347,14 @@
         <w:rPr>
           <w:b w:val="0"/>
         </w:rPr>
-        <w:t>Figure 10. Impurity-based raw fe</w:t>
-      </w:r>
-      <w:r>
-        <w:rPr>
-          <w:b w:val="0"/>
-        </w:rPr>
-        <w:t>ature importance from the final Diabetes Random Forest.</w:t>
+        <w:t>Figure 10. Impurity-based raw feature importance from the final Diabetes Random Forest.</w:t>
       </w:r>
     </w:p>
     <w:p>
       <w:pPr>
         <w:pStyle w:val="Heading2"/>
       </w:pPr>
-      <w:bookmarkStart w:id="28" w:name="_Toc238498264"/>
+      <w:bookmarkStart w:id="28" w:name="_Toc238500435"/>
       <w:r>
         <w:t>11.2 House Price Final Model</w:t>
       </w:r>
@@ -11642,13 +11481,7 @@
               <w:rPr>
                 <w:sz w:val="19"/>
               </w:rPr>
-              <w:t>1.2529 bil</w:t>
-            </w:r>
-            <w:r>
-              <w:rPr>
-                <w:sz w:val="19"/>
-              </w:rPr>
-              <w:t>lion VND</w:t>
+              <w:t>1.2529 billion VND</w:t>
             </w:r>
           </w:p>
         </w:tc>
@@ -11853,7 +11686,7 @@
         </w:rPr>
         <w:lastRenderedPageBreak/>
         <w:drawing>
-          <wp:inline distT="0" distB="0" distL="0" distR="0">
+          <wp:inline distT="0" distB="0" distL="0" distR="0" wp14:anchorId="38936421" wp14:editId="09750CCD">
             <wp:extent cx="5715000" cy="5720532"/>
             <wp:effectExtent l="0" t="0" r="0" b="0"/>
             <wp:docPr id="11" name="Picture 11"/>
@@ -11897,21 +11730,12 @@
         <w:rPr>
           <w:b w:val="0"/>
         </w:rPr>
-        <w:t>Figure 11. Actual vers</w:t>
-      </w:r>
-      <w:r>
-        <w:rPr>
-          <w:b w:val="0"/>
-        </w:rPr>
-        <w:t>us predicted listed prices for the selected House Price model.</w:t>
+        <w:t>Figure 11. Actual versus predicted listed prices for the selected House Price model.</w:t>
       </w:r>
     </w:p>
     <w:p>
       <w:r>
-        <w:t>Predictions follow the general y = x direction but occupy a narrower range than actual values, consistent with regression toward the centre of the training distribution. The residual mean is -0</w:t>
-      </w:r>
-      <w:r>
-        <w:t>.0255 billion VND, the median is -0.0803, and the residual standard deviation is 1.6016. Residuals range from -6.2601 to 5.8129 billion VND; the visible changing spread shows that individual errors remain material.</w:t>
+        <w:t>Predictions follow the general y = x direction but occupy a narrower range than actual values, consistent with regression toward the centre of the training distribution. The residual mean is -0.0255 billion VND, the median is -0.0803, and the residual standard deviation is 1.6016. Residuals range from -6.2601 to 5.8129 billion VND; the visible changing spread shows that individual errors remain material.</w:t>
       </w:r>
     </w:p>
     <w:p>
@@ -11925,7 +11749,7 @@
         </w:rPr>
         <w:lastRenderedPageBreak/>
         <w:drawing>
-          <wp:inline distT="0" distB="0" distL="0" distR="0">
+          <wp:inline distT="0" distB="0" distL="0" distR="0" wp14:anchorId="6A78BA89" wp14:editId="3498FE19">
             <wp:extent cx="5715000" cy="3787152"/>
             <wp:effectExtent l="0" t="0" r="0" b="0"/>
             <wp:docPr id="12" name="Picture 12"/>
@@ -11969,21 +11793,12 @@
         <w:rPr>
           <w:b w:val="0"/>
         </w:rPr>
-        <w:t>Figure 12. Residuals (actual minus pred</w:t>
-      </w:r>
-      <w:r>
-        <w:rPr>
-          <w:b w:val="0"/>
-        </w:rPr>
-        <w:t>icted) against predicted House Price.</w:t>
+        <w:t>Figure 12. Residuals (actual minus predicted) against predicted House Price.</w:t>
       </w:r>
     </w:p>
     <w:p>
       <w:r>
-        <w:t>The strongest transformed feature importances are numeric Area (0.2856), Bathrooms (0.2226), Floors (0.1094), Access Road (0.0770), and the Hồ Chí Minh Province indicator (0.0676). Because categories expand into multip</w:t>
-      </w:r>
-      <w:r>
-        <w:t>le encoded columns, these are encoded-feature values and are not incorrectly merged into raw-variable totals.</w:t>
+        <w:t>The strongest transformed feature importances are numeric Area (0.2856), Bathrooms (0.2226), Floors (0.1094), Access Road (0.0770), and the Hồ Chí Minh Province indicator (0.0676). Because categories expand into multiple encoded columns, these are encoded-feature values and are not incorrectly merged into raw-variable totals.</w:t>
       </w:r>
     </w:p>
     <w:p>
@@ -11996,7 +11811,7 @@
           <w:noProof/>
         </w:rPr>
         <w:drawing>
-          <wp:inline distT="0" distB="0" distL="0" distR="0">
+          <wp:inline distT="0" distB="0" distL="0" distR="0" wp14:anchorId="6C58E73C" wp14:editId="29ABE70E">
             <wp:extent cx="5715000" cy="3623121"/>
             <wp:effectExtent l="0" t="0" r="0" b="0"/>
             <wp:docPr id="13" name="Picture 13"/>
@@ -12053,7 +11868,7 @@
       <w:pPr>
         <w:pStyle w:val="Heading1"/>
       </w:pPr>
-      <w:bookmarkStart w:id="29" w:name="_Toc238498265"/>
+      <w:bookmarkStart w:id="29" w:name="_Toc238500436"/>
       <w:r>
         <w:lastRenderedPageBreak/>
         <w:t>12. Intelligent Application Architecture</w:t>
@@ -12062,10 +11877,7 @@
     </w:p>
     <w:p>
       <w:r>
-        <w:t>The appli</w:t>
-      </w:r>
-      <w:r>
-        <w:t xml:space="preserve">cation separates data-science artifacts from inference and presentation concerns. Executed notebooks create the trusted fitted Pipelines under </w:t>
+        <w:t xml:space="preserve">The application separates data-science artifacts from inference and presentation concerns. Executed notebooks create the trusted fitted Pipelines under </w:t>
       </w:r>
       <w:r>
         <w:rPr>
@@ -12075,10 +11887,7 @@
         <w:t>models/</w:t>
       </w:r>
       <w:r>
-        <w:t>. FastAPI loads both models once during application lifespan, validates their raw feature contracts agains</w:t>
-      </w:r>
-      <w:r>
-        <w:t xml:space="preserve">t JSON metadata, and creates a one-row pandas DataFrame in the exact saved </w:t>
+        <w:t xml:space="preserve">. FastAPI loads both models once during application lifespan, validates their raw feature contracts against JSON metadata, and creates a one-row pandas DataFrame in the exact saved </w:t>
       </w:r>
       <w:r>
         <w:rPr>
@@ -12093,13 +11902,7 @@
     </w:p>
     <w:p>
       <w:r>
-        <w:t>React/Vite and Expo React Native are thin clients. They request m</w:t>
-      </w:r>
-      <w:r>
-        <w:t>odel metadata, render fields from the shared contract, submit raw values, and display the prediction plus limitations. Neo4j is independent from prediction availability: a graph connection failure changes graph status but does not prevent either model from</w:t>
-      </w:r>
-      <w:r>
-        <w:t xml:space="preserve"> loading or predicting.</w:t>
+        <w:t>React/Vite and Expo React Native are thin clients. They request model metadata, render fields from the shared contract, submit raw values, and display the prediction plus limitations. Neo4j is independent from prediction availability: a graph connection failure changes graph status but does not prevent either model from loading or predicting.</w:t>
       </w:r>
     </w:p>
     <w:p>
@@ -12112,7 +11915,7 @@
           <w:noProof/>
         </w:rPr>
         <w:drawing>
-          <wp:inline distT="0" distB="0" distL="0" distR="0">
+          <wp:inline distT="0" distB="0" distL="0" distR="0" wp14:anchorId="42CBBA1C" wp14:editId="1CAF9C97">
             <wp:extent cx="5715000" cy="3330324"/>
             <wp:effectExtent l="0" t="0" r="0" b="0"/>
             <wp:docPr id="14" name="Picture 14"/>
@@ -12163,7 +11966,7 @@
       <w:pPr>
         <w:pStyle w:val="Heading1"/>
       </w:pPr>
-      <w:bookmarkStart w:id="30" w:name="_Toc238498266"/>
+      <w:bookmarkStart w:id="30" w:name="_Toc238500437"/>
       <w:r>
         <w:t>13. Backend and Model Inference</w:t>
       </w:r>
@@ -12181,10 +11984,7 @@
         <w:t>NaN</w:t>
       </w:r>
       <w:r>
-        <w:t>, and infinite values. Request size is limited, CORS origins are environment-controlled,</w:t>
-      </w:r>
-      <w:r>
-        <w:t xml:space="preserve"> and model exceptions return a generic error rather than a raw traceback. Only repository-controlled joblib files are loaded.</w:t>
+        <w:t>, and infinite values. Request size is limited, CORS origins are environment-controlled, and model exceptions return a generic error rather than a raw traceback. Only repository-controlled joblib files are loaded.</w:t>
       </w:r>
     </w:p>
     <w:p>
@@ -12288,10 +12088,7 @@
         <w:t>OneHotEncoder</w:t>
       </w:r>
       <w:r>
-        <w:t xml:space="preserve"> during pr</w:t>
-      </w:r>
-      <w:r>
-        <w:t>ediction.</w:t>
+        <w:t xml:space="preserve"> during prediction.</w:t>
       </w:r>
     </w:p>
     <w:p>
@@ -12626,13 +12423,7 @@
               <w:rPr>
                 <w:sz w:val="19"/>
               </w:rPr>
-              <w:t xml:space="preserve">Diabetes </w:t>
-            </w:r>
-            <w:r>
-              <w:rPr>
-                <w:sz w:val="19"/>
-              </w:rPr>
-              <w:t>feature/model contract</w:t>
+              <w:t>Diabetes feature/model contract</w:t>
             </w:r>
           </w:p>
         </w:tc>
@@ -12875,13 +12666,7 @@
               <w:rPr>
                 <w:sz w:val="19"/>
               </w:rPr>
-              <w:t>Educational listed-pri</w:t>
-            </w:r>
-            <w:r>
-              <w:rPr>
-                <w:sz w:val="19"/>
-              </w:rPr>
-              <w:t>ce estimate</w:t>
+              <w:t>Educational listed-price estimate</w:t>
             </w:r>
           </w:p>
         </w:tc>
@@ -12996,7 +12781,7 @@
       <w:pPr>
         <w:pStyle w:val="Heading1"/>
       </w:pPr>
-      <w:bookmarkStart w:id="31" w:name="_Toc238498267"/>
+      <w:bookmarkStart w:id="31" w:name="_Toc238500438"/>
       <w:r>
         <w:t>14. Web Application</w:t>
       </w:r>
@@ -13013,10 +12798,7 @@
         <w:t>raw</w:t>
       </w:r>
       <w:r>
-        <w:t xml:space="preserve"> feature names expected </w:t>
-      </w:r>
-      <w:r>
-        <w:t xml:space="preserve">by the backend, while the saved backend Pipeline performs imputation, scaling, and encoding. Responsive breakpoints adapt navigation, forms, result panels, cards, typography, and the graph layout for desktop, tablet, and phone widths.</w:t>
+        <w:t xml:space="preserve"> feature names expected by the backend, while the saved backend Pipeline performs imputation, scaling, and encoding. Responsive breakpoints adapt navigation, forms, result panels, cards, typography, and the graph layout for desktop, tablet, and phone widths.</w:t>
       </w:r>
     </w:p>
     <w:p>
@@ -13040,14 +12822,7 @@
           <w:rFonts w:ascii="Consolas" w:hAnsi="Consolas"/>
           <w:sz w:val="20"/>
         </w:rPr>
-        <w:t>VITE_API_BASE</w:t>
-      </w:r>
-      <w:r>
-        <w:rPr>
-          <w:rFonts w:ascii="Consolas" w:hAnsi="Consolas"/>
-          <w:sz w:val="20"/>
-        </w:rPr>
-        <w:t>_URL</w:t>
+        <w:t>VITE_API_BASE_URL</w:t>
       </w:r>
       <w:r>
         <w:t xml:space="preserve"> supplies the backend origin at build time. The Knowledge Graph page requests model-centric nodes and edges from FastAPI and renders them with a force-graph component. The force-directed canvas spaces nodes with configured forces, exposes relationship types as hover labels, provides an enlarged pointer area for every node, and synchronizes selection with an adjacent property panel.</w:t>
@@ -13057,7 +12832,7 @@
       <w:pPr>
         <w:pStyle w:val="Heading1"/>
       </w:pPr>
-      <w:bookmarkStart w:id="32" w:name="_Toc238498268"/>
+      <w:bookmarkStart w:id="32" w:name="_Toc238500439"/>
       <w:r>
         <w:t>15. Mobile Application</w:t>
       </w:r>
@@ -13066,9 +12841,6 @@
     <w:p>
       <w:r>
         <w:t xml:space="preserve">The mobile client uses Expo, React Native, and TypeScript. Its five screens are Home, Diabetes, House Price, Knowledge Graph, and About. The Diabetes and House screens obtain metadata and submit the same raw API contracts as the web application. </w:t>
-      </w:r>
-      <w:r>
-        <w:t xml:space="preserve"/>
       </w:r>
       <w:r>
         <w:rPr>
@@ -13078,22 +12850,17 @@
         <w:t>EXPO_PUBLIC_API_BASE_URL</w:t>
       </w:r>
       <w:r>
-        <w:t xml:space="preserve"> selects the backend URL appropriate to a browser, emulator, LAN</w:t>
-      </w:r>
-      <w:r>
-        <w:t xml:space="preserve">-connected physical device, or deployed API. The Knowledge Graph screen requests the existing graph endpoint and provides native node/relationship totals, a label legend, node property inspection, and navigable connections without depending on a desktop canvas.</w:t>
+        <w:t xml:space="preserve"> selects the backend URL appropriate to a browser, emulator, LAN-connected physical device, or deployed API. The Knowledge Graph screen requests the existing graph endpoint and provides native node/relationship totals, a label legend, node property inspection, and navigable connections without depending on a desktop canvas.</w:t>
       </w:r>
     </w:p>
     <w:p>
       <w:r>
-        <w:t xml:space="preserve">The current mobile delivery is demonstrated through Expo Go. The repository does not claim a Google Play or Apple App Store release. Static project evidence confirms the prediction and Knowledge Graph request paths and a TypeScript </w:t>
-      </w:r>
-      <w:r>
-        <w:t>type-checkable client; no independent store deployment is claimed.</w:t>
+        <w:t>The current mobile delivery is demonstrated through Expo Go. The repository does not claim a Google Play or Apple App Store release. Static project evidence confirms the prediction and Knowledge Graph request paths and a TypeScript type-checkable client; no independent store deployment is claimed.</w:t>
       </w:r>
     </w:p>
     <w:p>
       <w:r>
+        <w:lastRenderedPageBreak/>
         <w:br w:type="page"/>
       </w:r>
     </w:p>
@@ -13101,7 +12868,7 @@
       <w:pPr>
         <w:pStyle w:val="Heading1"/>
       </w:pPr>
-      <w:bookmarkStart w:id="33" w:name="_Toc238498269"/>
+      <w:bookmarkStart w:id="33" w:name="_Toc238500440"/>
       <w:r>
         <w:lastRenderedPageBreak/>
         <w:t>16. Diabetes Knowledge Graph</w:t>
@@ -13110,10 +12877,7 @@
     </w:p>
     <w:p>
       <w:r>
-        <w:t>The Neo4j AuraDB graph is transparent and model-centric. It records what the assignment system uses: the final model, six raw features, target, fitted preproc</w:t>
-      </w:r>
-      <w:r>
-        <w:t xml:space="preserve">essing steps, dataset provenance, model-selection experiment, held-out metrics, and fitted impurity importance. It is </w:t>
+        <w:t xml:space="preserve">The Neo4j AuraDB graph is transparent and model-centric. It records what the assignment system uses: the final model, six raw features, target, fitted preprocessing steps, dataset provenance, model-selection experiment, held-out metrics, and fitted impurity importance. It is </w:t>
       </w:r>
       <w:r>
         <w:rPr>
@@ -13127,19 +12891,7 @@
     </w:p>
     <w:p>
       <w:r>
-        <w:t xml:space="preserve">The same sourced graph is presented differently for each interface: the web client uses an interactive force-directed canvas with a details panel, while the mobile client uses a touch-oriented node explorer and explicit connection list. Both views consume the same FastAPI response and preserve the same 17-node/17-relationship graph semantics.</w:t>
-      </w:r>
-      <w:r>
-        <w:t xml:space="preserve"/>
-      </w:r>
-      <w:r>
-        <w:rPr>
-          <w:b/>
-        </w:rPr>
-        <w:t/>
-      </w:r>
-      <w:r>
-        <w:t xml:space="preserve"/>
+        <w:t>The same sourced graph is presented differently for each interface: the web client uses an interactive force-directed canvas with a details panel, while the mobile client uses a touch-oriented node explorer and explicit connection list. Both views consume the same FastAPI response and preserve the same 17-node/17-relationship graph semantics.</w:t>
       </w:r>
     </w:p>
     <w:p>
@@ -13184,14 +12936,7 @@
                 <w:b/>
                 <w:sz w:val="19"/>
               </w:rPr>
-              <w:t>C</w:t>
-            </w:r>
-            <w:r>
-              <w:rPr>
-                <w:b/>
-                <w:sz w:val="19"/>
-              </w:rPr>
-              <w:t>ategory</w:t>
+              <w:t>Category</w:t>
             </w:r>
           </w:p>
         </w:tc>
@@ -13450,17 +13195,14 @@
         <w:t>MERGE</w:t>
       </w:r>
       <w:r>
-        <w:t xml:space="preserve"> and a uniqueness constraint on assignment entity keys. Production seeding was recorded twice with identical totals—17 nodes and 17 relationships after the first execution, and 17/17 after the second—demonstrating idempotence. A direct production API check</w:t>
-      </w:r>
-      <w:r>
-        <w:t xml:space="preserve"> for this report also returned 17 nodes and 17 relationships.</w:t>
+        <w:t xml:space="preserve"> and a uniqueness constraint on assignment entity keys. Production seeding was recorded twice with identical totals—17 nodes and 17 relationships after the first execution, and 17/17 after the second—demonstrating idempotence. A direct production API check for this report also returned 17 nodes and 17 relationships.</w:t>
       </w:r>
     </w:p>
     <w:p>
       <w:pPr>
         <w:pStyle w:val="Heading1"/>
       </w:pPr>
-      <w:bookmarkStart w:id="34" w:name="_Toc238498270"/>
+      <w:bookmarkStart w:id="34" w:name="_Toc238500441"/>
       <w:r>
         <w:t>17. Deployment Architecture</w:t>
       </w:r>
@@ -13476,14 +13218,7 @@
             <w:color w:val="3E6C8A"/>
             <w:u w:val="single"/>
           </w:rPr>
-          <w:t>https://github.com/Sagitoaz/intelligent-system-assign</w:t>
-        </w:r>
-        <w:r>
-          <w:rPr>
-            <w:color w:val="3E6C8A"/>
-            <w:u w:val="single"/>
-          </w:rPr>
-          <w:t>ment-01</w:t>
+          <w:t>https://github.com/Sagitoaz/intelligent-system-assignment-01</w:t>
         </w:r>
       </w:hyperlink>
       <w:r>
@@ -13520,10 +13255,7 @@
         <w:keepNext/>
       </w:pPr>
       <w:r>
-        <w:t>T</w:t>
-      </w:r>
-      <w:r>
-        <w:t>able 17. Direct production validation performed for this report.</w:t>
+        <w:t>Table 17. Direct production validation performed for this report.</w:t>
       </w:r>
     </w:p>
     <w:tbl>
@@ -13666,13 +13398,7 @@
               <w:rPr>
                 <w:sz w:val="19"/>
               </w:rPr>
-              <w:t xml:space="preserve">HTTP 200; class 0; Non-diabetic; probability </w:t>
-            </w:r>
-            <w:r>
-              <w:rPr>
-                <w:sz w:val="19"/>
-              </w:rPr>
-              <w:t>0.01054453459068126</w:t>
+              <w:t>HTTP 200; class 0; Non-diabetic; probability 0.01054453459068126</w:t>
             </w:r>
           </w:p>
         </w:tc>
@@ -13814,18 +13540,12 @@
     </w:p>
     <w:p>
       <w:r>
-        <w:t xml:space="preserve">These checks verify the </w:t>
-      </w:r>
-      <w:r>
-        <w:t>backend prediction routes, graph retrieval, and web deployment at report-generation time. Mobile uses the same HTTPS endpoints through the code path documented above; this report does not claim a separately instrumented production mobile test beyond the cu</w:t>
-      </w:r>
-      <w:r>
-        <w:t>rrent project evidence and Expo Go demonstration record. Free-tier hosting can introduce cold-start delay, so initial requests may be slower than subsequent requests.</w:t>
+        <w:lastRenderedPageBreak/>
+        <w:t>These checks verify the backend prediction routes, graph retrieval, and web deployment at report-generation time. Mobile uses the same HTTPS endpoints through the code path documented above; this report does not claim a separately instrumented production mobile test beyond the current project evidence and Expo Go demonstration record. Free-tier hosting can introduce cold-start delay, so initial requests may be slower than subsequent requests.</w:t>
       </w:r>
     </w:p>
     <w:p>
       <w:r>
-        <w:lastRenderedPageBreak/>
         <w:br w:type="page"/>
       </w:r>
     </w:p>
@@ -13833,7 +13553,7 @@
       <w:pPr>
         <w:pStyle w:val="Heading1"/>
       </w:pPr>
-      <w:bookmarkStart w:id="35" w:name="_Toc238498271"/>
+      <w:bookmarkStart w:id="35" w:name="_Toc238500442"/>
       <w:r>
         <w:lastRenderedPageBreak/>
         <w:t>18. System Demonstration</w:t>
@@ -13842,10 +13562,7 @@
     </w:p>
     <w:p>
       <w:r>
-        <w:t>The notebooks include three synthetic cases for each fitted sy</w:t>
-      </w:r>
-      <w:r>
-        <w:t>stem. They use observed value ranges, are not copied from held-out rows, and pass directly through the complete saved Pipeline without manual preprocessing.</w:t>
+        <w:t>The notebooks include three synthetic cases for each fitted system. They use observed value ranges, are not copied from held-out rows, and pass directly through the complete saved Pipeline without manual preprocessing.</w:t>
       </w:r>
     </w:p>
     <w:p>
@@ -14606,10 +14323,7 @@
     </w:p>
     <w:p>
       <w:r>
-        <w:t xml:space="preserve">The labels demonstrate classifier mechanics only. They are not </w:t>
-      </w:r>
-      <w:r>
-        <w:t>medical diagnoses, validated patient risk estimates, or healthcare advice.</w:t>
+        <w:t>The labels demonstrate classifier mechanics only. They are not medical diagnoses, validated patient risk estimates, or healthcare advice.</w:t>
       </w:r>
     </w:p>
     <w:p>
@@ -14829,14 +14543,7 @@
                 <w:b/>
                 <w:sz w:val="18"/>
               </w:rPr>
-              <w:t xml:space="preserve">Predicted </w:t>
-            </w:r>
-            <w:r>
-              <w:rPr>
-                <w:b/>
-                <w:sz w:val="18"/>
-              </w:rPr>
-              <w:t>Price</w:t>
+              <w:t>Predicted Price</w:t>
             </w:r>
           </w:p>
         </w:tc>
@@ -15345,13 +15052,7 @@
               <w:rPr>
                 <w:sz w:val="18"/>
               </w:rPr>
-              <w:t xml:space="preserve">Sale </w:t>
-            </w:r>
-            <w:r>
-              <w:rPr>
-                <w:sz w:val="18"/>
-              </w:rPr>
-              <w:t>contract / Full</w:t>
+              <w:t>Sale contract / Full</w:t>
             </w:r>
           </w:p>
         </w:tc>
@@ -15395,7 +15096,7 @@
       <w:pPr>
         <w:pStyle w:val="Heading1"/>
       </w:pPr>
-      <w:bookmarkStart w:id="36" w:name="_Toc238498272"/>
+      <w:bookmarkStart w:id="36" w:name="_Toc238500443"/>
       <w:r>
         <w:lastRenderedPageBreak/>
         <w:t>19. Limitations</w:t>
@@ -15404,32 +15105,17 @@
     </w:p>
     <w:p>
       <w:r>
-        <w:t xml:space="preserve">The Diabetes dataset contains only 768 observations and has limited population coverage. Missing measurements are encoded as zero, the target is imbalanced, and the final recall (0.5556) and F1 (0.6061) remain limited. The evaluation does </w:t>
-      </w:r>
-      <w:r>
-        <w:t>not establish calibration, fairness, safety, prospective utility, external generalization, or clinically acceptable error costs. The system is not clinically validated and must remain an educational classification demonstration.</w:t>
+        <w:t>The Diabetes dataset contains only 768 observations and has limited population coverage. Missing measurements are encoded as zero, the target is imbalanced, and the final recall (0.5556) and F1 (0.6061) remain limited. The evaluation does not establish calibration, fairness, safety, prospective utility, external generalization, or clinically acceptable error costs. The system is not clinically validated and must remain an educational classification demonstration.</w:t>
       </w:r>
     </w:p>
     <w:p>
       <w:r>
-        <w:t xml:space="preserve">The house data consists of </w:t>
-      </w:r>
-      <w:r>
-        <w:t xml:space="preserve">2024 listings and is geographically concentrated, especially in Hồ Chí Minh and Hà Nội. Many attributes are missing, Address-to-Province extraction is an imperfect substitute for geocoding, and a listing price may differ from the actual transaction price. </w:t>
-      </w:r>
-      <w:r>
-        <w:t>Market conditions change over time. Final RMSE remains 1.6018 billion VND, which is substantial for individual properties, so the output is not a professional valuation.</w:t>
+        <w:t>The house data consists of 2024 listings and is geographically concentrated, especially in Hồ Chí Minh and Hà Nội. Many attributes are missing, Address-to-Province extraction is an imperfect substitute for geocoding, and a listing price may differ from the actual transaction price. Market conditions change over time. Final RMSE remains 1.6018 billion VND, which is substantial for individual properties, so the output is not a professional valuation.</w:t>
       </w:r>
     </w:p>
     <w:p>
       <w:r>
-        <w:t>The application also has operational limitations. Free-tier cloud services may sleep o</w:t>
-      </w:r>
-      <w:r>
-        <w:t>r cold-start; network and third-party service availability affect the demonstration; graph availability is deliberately decoupled from prediction; and Expo Go is a demonstration environment rather than an app-store deployment. The entire system is an educa</w:t>
-      </w:r>
-      <w:r>
-        <w:t>tional deployment, not evidence of clinical, commercial, or production readiness.</w:t>
+        <w:t>The application also has operational limitations. Free-tier cloud services may sleep or cold-start; network and third-party service availability affect the demonstration; graph availability is deliberately decoupled from prediction; and Expo Go is a demonstration environment rather than an app-store deployment. The entire system is an educational deployment, not evidence of clinical, commercial, or production readiness.</w:t>
       </w:r>
     </w:p>
     <w:p>
@@ -15744,13 +15430,7 @@
               <w:rPr>
                 <w:sz w:val="19"/>
               </w:rPr>
-              <w:t xml:space="preserve">Free-tier services </w:t>
-            </w:r>
-            <w:r>
-              <w:rPr>
-                <w:sz w:val="19"/>
-              </w:rPr>
-              <w:t>and network dependency</w:t>
+              <w:t>Free-tier services and network dependency</w:t>
             </w:r>
           </w:p>
         </w:tc>
@@ -15803,7 +15483,7 @@
       <w:pPr>
         <w:pStyle w:val="Heading1"/>
       </w:pPr>
-      <w:bookmarkStart w:id="37" w:name="_Toc238498273"/>
+      <w:bookmarkStart w:id="37" w:name="_Toc238500444"/>
       <w:r>
         <w:t>20. Reflection</w:t>
       </w:r>
@@ -15811,41 +15491,23 @@
     </w:p>
     <w:p>
       <w:r>
-        <w:t xml:space="preserve">The majority-class Diabetes baseline is one of the most informative results: 64.94% Accuracy initially appears usable, yet </w:t>
-      </w:r>
-      <w:r>
-        <w:t>Precision, Recall, and F1 are zero because every observation is predicted as the majority class. Evaluation must reflect the error that matters, not only the easiest aggregate score.</w:t>
+        <w:t>The majority-class Diabetes baseline is one of the most informative results: 64.94% Accuracy initially appears usable, yet Precision, Recall, and F1 are zero because every observation is predicted as the majority class. Evaluation must reflect the error that matters, not only the easiest aggregate score.</w:t>
       </w:r>
     </w:p>
     <w:p>
       <w:r>
-        <w:t>Representation has measurable consequences. The same tuned Diabetes fores</w:t>
-      </w:r>
-      <w:r>
-        <w:t>t performs better with six features than eight, showing that more inputs are not automatically better when missingness and finite sample size are present. The House system reaches the opposite empirical conclusion: five additional usable attributes improve</w:t>
-      </w:r>
-      <w:r>
-        <w:t xml:space="preserve"> mean CV RMSE from 1.6526 to 1.6078. Representation should therefore be tested for each problem rather than treated as a fixed preprocessing detail.</w:t>
+        <w:t>Representation has measurable consequences. The same tuned Diabetes forest performs better with six features than eight, showing that more inputs are not automatically better when missingness and finite sample size are present. The House system reaches the opposite empirical conclusion: five additional usable attributes improve mean CV RMSE from 1.6526 to 1.6078. Representation should therefore be tested for each problem rather than treated as a fixed preprocessing detail.</w:t>
       </w:r>
     </w:p>
     <w:p>
       <w:r>
         <w:lastRenderedPageBreak/>
-        <w:t>Cross-validation and a held-out test answer different questions. The depth-6 Diabetes forest is selected be</w:t>
-      </w:r>
-      <w:r>
-        <w:t>cause it has the best average training-fold F1, even though its test F1 is below the initially observed unrestricted forest. Revising the choice after seeing that test difference would convert the test set into a tuning resource. Controlled experiments pre</w:t>
-      </w:r>
-      <w:r>
-        <w:t>serve the test boundary and make the decision reproducible.</w:t>
+        <w:t>Cross-validation and a held-out test answer different questions. The depth-6 Diabetes forest is selected because it has the best average training-fold F1, even though its test F1 is below the initially observed unrestricted forest. Revising the choice after seeing that test difference would convert the test set into a tuning resource. Controlled experiments preserve the test boundary and make the decision reproducible.</w:t>
       </w:r>
     </w:p>
     <w:p>
       <w:r>
-        <w:t>The saved Pipeline connects experimental discipline to software reliability. It guarantees that training-time medians, scales, categories, and estimator parameters are exactly those used by FastAP</w:t>
-      </w:r>
-      <w:r>
-        <w:t xml:space="preserve">I. Web and mobile remain clients of a raw-feature contract. This confirms the central lesson of the assignment: an intelligent system is more than </w:t>
+        <w:t xml:space="preserve">The saved Pipeline connects experimental discipline to software reliability. It guarantees that training-time medians, scales, categories, and estimator parameters are exactly those used by FastAPI. Web and mobile remain clients of a raw-feature contract. This confirms the central lesson of the assignment: an intelligent system is more than </w:t>
       </w:r>
       <w:r>
         <w:rPr>
@@ -15855,17 +15517,14 @@
         <w:t>model.fit()</w:t>
       </w:r>
       <w:r>
-        <w:t>; it is a coordinated data, representation, evaluation, inference, interface, and deployment workf</w:t>
-      </w:r>
-      <w:r>
-        <w:t>low.</w:t>
+        <w:t>; it is a coordinated data, representation, evaluation, inference, interface, and deployment workflow.</w:t>
       </w:r>
     </w:p>
     <w:p>
       <w:pPr>
         <w:pStyle w:val="Heading1"/>
       </w:pPr>
-      <w:bookmarkStart w:id="38" w:name="_Toc238498274"/>
+      <w:bookmarkStart w:id="38" w:name="_Toc238500445"/>
       <w:r>
         <w:t>21. Conclusion</w:t>
       </w:r>
@@ -15873,21 +15532,12 @@
     </w:p>
     <w:p>
       <w:r>
-        <w:t>Assignment 01 delivers two complete educational intelligent systems: Diabetes Classification and Vietnam House Price Regression. Both include dataset inspection, explicit representation, EDA, missing-data preprocessing, a baseline, five</w:t>
-      </w:r>
-      <w:r>
-        <w:t xml:space="preserve"> traditional machine-learning families, controlled experiments, final selection, a saved fitted Pipeline, FastAPI inference, a React web client, and an Expo React Native mobile client. Diabetes additionally includes a deployed Neo4j model/provenance Knowle</w:t>
-      </w:r>
-      <w:r>
-        <w:t>dge Graph.</w:t>
+        <w:t>Assignment 01 delivers two complete educational intelligent systems: Diabetes Classification and Vietnam House Price Regression. Both include dataset inspection, explicit representation, EDA, missing-data preprocessing, a baseline, five traditional machine-learning families, controlled experiments, final selection, a saved fitted Pipeline, FastAPI inference, a React web client, and an Expo React Native mobile client. Diabetes additionally includes a deployed Neo4j model/provenance Knowledge Graph.</w:t>
       </w:r>
     </w:p>
     <w:p>
       <w:r>
-        <w:t>The final Diabetes system uses a six-feature depth-6 Random Forest and achieves held-out Accuracy 0.7468, Precision 0.6667, Recall 0.5556, and F1 0.6061. The final House Price system uses eleven raw features and a depth-12 Random Forest, achievi</w:t>
-      </w:r>
-      <w:r>
-        <w:t>ng MAE 1.2529, RMSE 1.6018 billion VND, R² 0.4738, and MAPE 27.36%. These results demonstrate a coherent assignment workflow; they do not establish clinical, professional valuation, commercial, or production readiness.</w:t>
+        <w:t>The final Diabetes system uses a six-feature depth-6 Random Forest and achieves held-out Accuracy 0.7468, Precision 0.6667, Recall 0.5556, and F1 0.6061. The final House Price system uses eleven raw features and a depth-12 Random Forest, achieving MAE 1.2529, RMSE 1.6018 billion VND, R² 0.4738, and MAPE 27.36%. These results demonstrate a coherent assignment workflow; they do not establish clinical, professional valuation, commercial, or production readiness.</w:t>
       </w:r>
     </w:p>
     <w:p>
@@ -15899,7 +15549,7 @@
       <w:pPr>
         <w:pStyle w:val="Heading1"/>
       </w:pPr>
-      <w:bookmarkStart w:id="39" w:name="_Toc238498275"/>
+      <w:bookmarkStart w:id="39" w:name="_Toc238500446"/>
       <w:r>
         <w:lastRenderedPageBreak/>
         <w:t>22. Reproducibility</w:t>
@@ -15908,10 +15558,7 @@
     </w:p>
     <w:p>
       <w:r>
-        <w:t>The executed no</w:t>
-      </w:r>
-      <w:r>
-        <w:t xml:space="preserve">tebooks record Python 3.12.0, pandas 3.0.5, NumPy 2.5.2, matplotlib 3.11.1, scikit-learn 1.9.0, and joblib 1.5.3. Random splits, shuffled KFold, Decision Trees, and Random Forests use </w:t>
+        <w:t xml:space="preserve">The executed notebooks record Python 3.12.0, pandas 3.0.5, NumPy 2.5.2, matplotlib 3.11.1, scikit-learn 1.9.0, and joblib 1.5.3. Random splits, shuffled KFold, Decision Trees, and Random Forests use </w:t>
       </w:r>
       <w:r>
         <w:rPr>
@@ -15921,10 +15568,7 @@
         <w:t>random_state=42</w:t>
       </w:r>
       <w:r>
-        <w:t xml:space="preserve"> where supported. Diabetes uses a stratified 80/20 split;</w:t>
-      </w:r>
-      <w:r>
-        <w:t xml:space="preserve"> House Price uses an 80/20 split and shuffled five-fold training CV. Fitted preprocessing lives inside every validation fold and inside the saved joblib artifact.</w:t>
+        <w:t xml:space="preserve"> where supported. Diabetes uses a stratified 80/20 split; House Price uses an 80/20 split and shuffled five-fold training CV. Fitted preprocessing lives inside every validation fold and inside the saved joblib artifact.</w:t>
       </w:r>
     </w:p>
     <w:p>
@@ -15990,14 +15634,7 @@
                 <w:b/>
                 <w:sz w:val="19"/>
               </w:rPr>
-              <w:t xml:space="preserve">Main tools / versions evidenced by </w:t>
-            </w:r>
-            <w:r>
-              <w:rPr>
-                <w:b/>
-                <w:sz w:val="19"/>
-              </w:rPr>
-              <w:t>project</w:t>
+              <w:t>Main tools / versions evidenced by project</w:t>
             </w:r>
           </w:p>
         </w:tc>
@@ -16232,9 +15869,6 @@
       <w:pPr>
         <w:pStyle w:val="CodeBlock"/>
         <w:keepLines/>
-        <w:rPr>
-          <w:rFonts w:hint="eastAsia"/>
-        </w:rPr>
       </w:pPr>
       <w:r>
         <w:t>python -m venv .venv</w:t>
@@ -16245,10 +15879,7 @@
       </w:r>
       <w:r>
         <w:br/>
-        <w:t xml:space="preserve">python -m pip install </w:t>
-      </w:r>
-      <w:r>
-        <w:t>-r backend\requirements.txt</w:t>
+        <w:t>python -m pip install -r backend\requirements.txt</w:t>
       </w:r>
       <w:r>
         <w:br/>
@@ -16308,14 +15939,7 @@
           <w:rFonts w:ascii="Consolas" w:hAnsi="Consolas"/>
           <w:sz w:val="20"/>
         </w:rPr>
-        <w:t>PYTH</w:t>
-      </w:r>
-      <w:r>
-        <w:rPr>
-          <w:rFonts w:ascii="Consolas" w:hAnsi="Consolas"/>
-          <w:sz w:val="20"/>
-        </w:rPr>
-        <w:t>ONPATH=backend</w:t>
+        <w:t>PYTHONPATH=backend</w:t>
       </w:r>
       <w:r>
         <w:t xml:space="preserve">, </w:t>
@@ -16355,19 +15979,13 @@
       <w:pPr>
         <w:pStyle w:val="CodeBlock"/>
         <w:keepLines/>
-        <w:rPr>
-          <w:rFonts w:hint="eastAsia"/>
-        </w:rPr>
       </w:pPr>
       <w:r>
         <w:t>.venv\Scripts\python.exe -m pip install -r docs\report\requirements-report.txt</w:t>
       </w:r>
       <w:r>
         <w:br/>
-        <w:t>.venv\Scripts\python.exe docs\re</w:t>
-      </w:r>
-      <w:r>
-        <w:t>port\build_report.py</w:t>
+        <w:t>.venv\Scripts\python.exe docs\report\build_report.py</w:t>
       </w:r>
     </w:p>
     <w:p>
@@ -16379,7 +15997,7 @@
       <w:pPr>
         <w:pStyle w:val="Heading1"/>
       </w:pPr>
-      <w:bookmarkStart w:id="40" w:name="_Toc238498276"/>
+      <w:bookmarkStart w:id="40" w:name="_Toc238500447"/>
       <w:r>
         <w:lastRenderedPageBreak/>
         <w:t>23. References</w:t>
@@ -16401,10 +16019,7 @@
         <w:ind w:firstLine="0"/>
       </w:pPr>
       <w:r>
-        <w:t>Kaggle. *Vie</w:t>
-      </w:r>
-      <w:r>
-        <w:t xml:space="preserve">tnam Housing Dataset 2024*. </w:t>
+        <w:t xml:space="preserve">Kaggle. *Vietnam Housing Dataset 2024*. </w:t>
       </w:r>
       <w:hyperlink r:id="rId26">
         <w:r>
@@ -16580,14 +16195,7 @@
             <w:color w:val="3E6C8A"/>
             <w:u w:val="single"/>
           </w:rPr>
-          <w:t>https://vercel.</w:t>
-        </w:r>
-        <w:r>
-          <w:rPr>
-            <w:color w:val="3E6C8A"/>
-            <w:u w:val="single"/>
-          </w:rPr>
-          <w:t>com/docs</w:t>
+          <w:t>https://vercel.com/docs</w:t>
         </w:r>
       </w:hyperlink>
       <w:r>
@@ -16624,7 +16232,7 @@
       <w:pPr>
         <w:pStyle w:val="Heading1"/>
       </w:pPr>
-      <w:bookmarkStart w:id="41" w:name="_Toc238498277"/>
+      <w:bookmarkStart w:id="41" w:name="_Toc238500448"/>
       <w:r>
         <w:lastRenderedPageBreak/>
         <w:t>Appendix A – API Endpoints</w:t>
@@ -16675,14 +16283,7 @@
                 <w:b/>
                 <w:sz w:val="19"/>
               </w:rPr>
-              <w:t>Meth</w:t>
-            </w:r>
-            <w:r>
-              <w:rPr>
-                <w:b/>
-                <w:sz w:val="19"/>
-              </w:rPr>
-              <w:t>od and path</w:t>
+              <w:t>Method and path</w:t>
             </w:r>
           </w:p>
         </w:tc>
@@ -17131,13 +16732,7 @@
               <w:rPr>
                 <w:sz w:val="19"/>
               </w:rPr>
-              <w:t xml:space="preserve">Class, label, </w:t>
-            </w:r>
-            <w:r>
-              <w:rPr>
-                <w:sz w:val="19"/>
-              </w:rPr>
-              <w:t>probability, model, disclaimer</w:t>
+              <w:t>Class, label, probability, model, disclaimer</w:t>
             </w:r>
           </w:p>
         </w:tc>
@@ -17508,7 +17103,7 @@
       <w:pPr>
         <w:pStyle w:val="Heading1"/>
       </w:pPr>
-      <w:bookmarkStart w:id="42" w:name="_Toc238498278"/>
+      <w:bookmarkStart w:id="42" w:name="_Toc238500449"/>
       <w:r>
         <w:t>Appendix B – Project Structure</w:t>
       </w:r>
@@ -17518,15 +17113,9 @@
       <w:pPr>
         <w:pStyle w:val="CodeBlock"/>
         <w:keepLines/>
-        <w:rPr>
-          <w:rFonts w:hint="eastAsia"/>
-        </w:rPr>
       </w:pPr>
       <w:r>
-        <w:t>data/                 Diabetes a</w:t>
-      </w:r>
-      <w:r>
-        <w:t>nd Vietnam housing CSV datasets</w:t>
+        <w:t>data/                 Diabetes and Vietnam housing CSV datasets</w:t>
       </w:r>
       <w:r>
         <w:br/>
@@ -17542,10 +17131,7 @@
       </w:r>
       <w:r>
         <w:br/>
-        <w:t xml:space="preserve">backend/              FastAPI app, metadata, </w:t>
-      </w:r>
-      <w:r>
-        <w:t>services, schemas, and tests</w:t>
+        <w:t>backend/              FastAPI app, metadata, services, schemas, and tests</w:t>
       </w:r>
       <w:r>
         <w:br/>
@@ -17561,10 +17147,7 @@
       </w:r>
       <w:r>
         <w:br/>
-        <w:t>docs/                 Architecture, API, and thi</w:t>
-      </w:r>
-      <w:r>
-        <w:t>s technical report</w:t>
+        <w:t>docs/                 Architecture, API, and this technical report</w:t>
       </w:r>
     </w:p>
     <w:p>
@@ -17599,17 +17182,14 @@
         <w:t>docs/report/build_report.py</w:t>
       </w:r>
       <w:r>
-        <w:t>, report-only requirements, and the two generated diagram assets. Notebook, model, backend, web, mobile, and knowl</w:t>
-      </w:r>
-      <w:r>
-        <w:t>edge-graph source files are not modified by report generation.</w:t>
+        <w:t>, report-only requirements, and the two generated diagram assets. Notebook, model, backend, web, mobile, and knowledge-graph source files are not modified by report generation.</w:t>
       </w:r>
     </w:p>
     <w:p>
       <w:pPr>
         <w:pStyle w:val="Heading1"/>
       </w:pPr>
-      <w:bookmarkStart w:id="43" w:name="_Toc238498279"/>
+      <w:bookmarkStart w:id="43" w:name="_Toc238500450"/>
       <w:r>
         <w:t>Appendix C – Demo Input Cases</w:t>
       </w:r>
@@ -19536,7 +19116,7 @@
       <w:rPr>
         <w:noProof/>
       </w:rPr>
-      <w:t>3</w:t>
+      <w:t>2</w:t>
     </w:r>
     <w:r>
       <w:fldChar w:fldCharType="end"/>
@@ -31547,7 +31127,7 @@
 </file>
 
 <file path=customXml/itemProps1.xml><?xml version="1.0" encoding="utf-8"?>
-<ds:datastoreItem xmlns:ds="http://schemas.openxmlformats.org/officeDocument/2006/customXml" ds:itemID="{EAFB9B6C-23D3-451A-BC1C-B23BFF8AE612}">
+<ds:datastoreItem xmlns:ds="http://schemas.openxmlformats.org/officeDocument/2006/customXml" ds:itemID="{F2747BA9-CF7B-4B13-9973-A916B066B884}">
   <ds:schemaRefs>
     <ds:schemaRef ds:uri="http://schemas.openxmlformats.org/officeDocument/2006/bibliography"/>
   </ds:schemaRefs>

</xml_diff>

<commit_message>
docs: add final application screenshots to report
</commit_message>
<xml_diff>
--- a/docs/report/TECHNICAL_REPORT.docx
+++ b/docs/report/TECHNICAL_REPORT.docx
@@ -14249,6 +14249,57 @@
     </w:p>
     <w:p>
       <w:pPr>
+        <w:ind w:firstLine="0"/>
+        <w:jc w:val="center"/>
+      </w:pPr>
+      <w:r>
+        <w:drawing>
+          <wp:inline xmlns:a="http://schemas.openxmlformats.org/drawingml/2006/main" xmlns:pic="http://schemas.openxmlformats.org/drawingml/2006/picture">
+            <wp:extent cx="5715000" cy="2653286"/>
+            <wp:docPr id="15" name="Picture 15"/>
+            <wp:cNvGraphicFramePr>
+              <a:graphicFrameLocks noChangeAspect="1"/>
+            </wp:cNvGraphicFramePr>
+            <a:graphic>
+              <a:graphicData uri="http://schemas.openxmlformats.org/drawingml/2006/picture">
+                <pic:pic>
+                  <pic:nvPicPr>
+                    <pic:cNvPr id="0" name="web_diabetes_prediction.png"/>
+                    <pic:cNvPicPr/>
+                  </pic:nvPicPr>
+                  <pic:blipFill>
+                    <a:blip r:embed="rId28"/>
+                    <a:stretch>
+                      <a:fillRect/>
+                    </a:stretch>
+                  </pic:blipFill>
+                  <pic:spPr>
+                    <a:xfrm>
+                      <a:off x="0" y="0"/>
+                      <a:ext cx="5715000" cy="2653286"/>
+                    </a:xfrm>
+                    <a:prstGeom prst="rect"/>
+                  </pic:spPr>
+                </pic:pic>
+              </a:graphicData>
+            </a:graphic>
+          </wp:inline>
+        </w:drawing>
+      </w:r>
+    </w:p>
+    <w:p>
+      <w:pPr>
+        <w:pStyle w:val="Caption"/>
+      </w:pPr>
+      <w:r>
+        <w:rPr>
+          <w:b w:val="0"/>
+        </w:rPr>
+        <w:t>Hình 15. Giao diện web desktop thực hiện ca demo tiểu đường 1 và trả dự đoán Non-diabetic với xác suất lớp 1 là 1,1%.</w:t>
+      </w:r>
+    </w:p>
+    <w:p>
+      <w:pPr>
         <w:pStyle w:val="Caption"/>
         <w:keepNext/>
       </w:pPr>
@@ -15285,24 +15336,266 @@
       </w:r>
     </w:p>
     <w:p>
+      <w:pPr>
+        <w:ind w:firstLine="0"/>
+        <w:jc w:val="center"/>
+      </w:pPr>
+      <w:r>
+        <w:drawing>
+          <wp:inline xmlns:a="http://schemas.openxmlformats.org/drawingml/2006/main" xmlns:pic="http://schemas.openxmlformats.org/drawingml/2006/picture">
+            <wp:extent cx="5715000" cy="2629437"/>
+            <wp:docPr id="16" name="Picture 16"/>
+            <wp:cNvGraphicFramePr>
+              <a:graphicFrameLocks noChangeAspect="1"/>
+            </wp:cNvGraphicFramePr>
+            <a:graphic>
+              <a:graphicData uri="http://schemas.openxmlformats.org/drawingml/2006/picture">
+                <pic:pic>
+                  <pic:nvPicPr>
+                    <pic:cNvPr id="0" name="web_house_price_prediction.png"/>
+                    <pic:cNvPicPr/>
+                  </pic:nvPicPr>
+                  <pic:blipFill>
+                    <a:blip r:embed="rId29"/>
+                    <a:stretch>
+                      <a:fillRect/>
+                    </a:stretch>
+                  </pic:blipFill>
+                  <pic:spPr>
+                    <a:xfrm>
+                      <a:off x="0" y="0"/>
+                      <a:ext cx="5715000" cy="2629437"/>
+                    </a:xfrm>
+                    <a:prstGeom prst="rect"/>
+                  </pic:spPr>
+                </pic:pic>
+              </a:graphicData>
+            </a:graphic>
+          </wp:inline>
+        </w:drawing>
+      </w:r>
+    </w:p>
+    <w:p>
+      <w:pPr>
+        <w:pStyle w:val="Caption"/>
+      </w:pPr>
       <w:r>
         <w:rPr>
           <w:b w:val="0"/>
         </w:rPr>
-        <w:t xml:space="preserve">Ảnh giao diện thực tế cần chụp đúng bản chạy thật: web dự đoán tiểu đường, web dự đoán giá nhà, web Knowledge Graph có panel chi tiết, mobile prediction và mobile Knowledge Graph. Quy cách và dữ liệu nằm trong </w:t>
-      </w:r>
-      <w:r>
-        <w:rPr>
-          <w:rFonts w:ascii="Consolas" w:hAnsi="Consolas"/>
-          <w:sz w:val="20"/>
-        </w:rPr>
-        <w:t>docs/report/SCREENSHOT_GUIDE.md</w:t>
-      </w:r>
+        <w:t>Hình 16. Giao diện web desktop thực hiện ca demo giá nhà 1 và trả giá ước tính 5,13 tỷ VND.</w:t>
+      </w:r>
+    </w:p>
+    <w:p>
+      <w:pPr>
+        <w:ind w:firstLine="0"/>
+        <w:jc w:val="center"/>
+      </w:pPr>
+      <w:r>
+        <w:drawing>
+          <wp:inline xmlns:a="http://schemas.openxmlformats.org/drawingml/2006/main" xmlns:pic="http://schemas.openxmlformats.org/drawingml/2006/picture">
+            <wp:extent cx="5715000" cy="2653286"/>
+            <wp:docPr id="17" name="Picture 17"/>
+            <wp:cNvGraphicFramePr>
+              <a:graphicFrameLocks noChangeAspect="1"/>
+            </wp:cNvGraphicFramePr>
+            <a:graphic>
+              <a:graphicData uri="http://schemas.openxmlformats.org/drawingml/2006/picture">
+                <pic:pic>
+                  <pic:nvPicPr>
+                    <pic:cNvPr id="0" name="web_knowledge_graph.png"/>
+                    <pic:cNvPicPr/>
+                  </pic:nvPicPr>
+                  <pic:blipFill>
+                    <a:blip r:embed="rId30"/>
+                    <a:stretch>
+                      <a:fillRect/>
+                    </a:stretch>
+                  </pic:blipFill>
+                  <pic:spPr>
+                    <a:xfrm>
+                      <a:off x="0" y="0"/>
+                      <a:ext cx="5715000" cy="2653286"/>
+                    </a:xfrm>
+                    <a:prstGeom prst="rect"/>
+                  </pic:spPr>
+                </pic:pic>
+              </a:graphicData>
+            </a:graphic>
+          </wp:inline>
+        </w:drawing>
+      </w:r>
+    </w:p>
+    <w:p>
+      <w:pPr>
+        <w:pStyle w:val="Caption"/>
+      </w:pPr>
       <w:r>
         <w:rPr>
           <w:b w:val="0"/>
         </w:rPr>
-        <w:t>; báo cáo không dùng mockup làm bằng chứng chạy hệ thống.</w:t>
+        <w:t>Hình 17. Knowledge Graph trên web hiển thị đủ 17 node, 17 relationship và thuộc tính của node Diabetes Prediction System.</w:t>
+      </w:r>
+    </w:p>
+    <w:p>
+      <w:r>
+        <w:rPr>
+          <w:b w:val="0"/>
+        </w:rPr>
+        <w:t>Ba ảnh dọc dưới đây kiểm tra cùng ứng dụng web ở viewport điện thoại. Chúng chứng minh navigation, card, form kết quả và canvas graph thích ứng theo chiều rộng màn hình. Các ảnh này không được trình bày như ảnh Expo React Native; bằng chứng mobile Expo trong báo cáo vẫn giới hạn ở source code, type-check và quá trình trình diễn qua Expo Go đã nêu tại Mục 15.</w:t>
+      </w:r>
+    </w:p>
+    <w:p>
+      <w:pPr>
+        <w:ind w:firstLine="0"/>
+        <w:jc w:val="center"/>
+      </w:pPr>
+      <w:r>
+        <w:drawing>
+          <wp:inline xmlns:a="http://schemas.openxmlformats.org/drawingml/2006/main" xmlns:pic="http://schemas.openxmlformats.org/drawingml/2006/picture">
+            <wp:extent cx="3056411" cy="6629399"/>
+            <wp:docPr id="18" name="Picture 18"/>
+            <wp:cNvGraphicFramePr>
+              <a:graphicFrameLocks noChangeAspect="1"/>
+            </wp:cNvGraphicFramePr>
+            <a:graphic>
+              <a:graphicData uri="http://schemas.openxmlformats.org/drawingml/2006/picture">
+                <pic:pic>
+                  <pic:nvPicPr>
+                    <pic:cNvPr id="0" name="web_responsive_mobile.png"/>
+                    <pic:cNvPicPr/>
+                  </pic:nvPicPr>
+                  <pic:blipFill>
+                    <a:blip r:embed="rId31"/>
+                    <a:stretch>
+                      <a:fillRect/>
+                    </a:stretch>
+                  </pic:blipFill>
+                  <pic:spPr>
+                    <a:xfrm>
+                      <a:off x="0" y="0"/>
+                      <a:ext cx="3056411" cy="6629399"/>
+                    </a:xfrm>
+                    <a:prstGeom prst="rect"/>
+                  </pic:spPr>
+                </pic:pic>
+              </a:graphicData>
+            </a:graphic>
+          </wp:inline>
+        </w:drawing>
+      </w:r>
+    </w:p>
+    <w:p>
+      <w:pPr>
+        <w:pStyle w:val="Caption"/>
+      </w:pPr>
+      <w:r>
+        <w:rPr>
+          <w:b w:val="0"/>
+        </w:rPr>
+        <w:t>Hình 18. Trang Home của web tại viewport điện thoại, với menu hamburger và card hệ thống xếp một cột.</w:t>
+      </w:r>
+    </w:p>
+    <w:p>
+      <w:pPr>
+        <w:ind w:firstLine="0"/>
+        <w:jc w:val="center"/>
+      </w:pPr>
+      <w:r>
+        <w:drawing>
+          <wp:inline xmlns:a="http://schemas.openxmlformats.org/drawingml/2006/main" xmlns:pic="http://schemas.openxmlformats.org/drawingml/2006/picture">
+            <wp:extent cx="3000228" cy="6629399"/>
+            <wp:docPr id="19" name="Picture 19"/>
+            <wp:cNvGraphicFramePr>
+              <a:graphicFrameLocks noChangeAspect="1"/>
+            </wp:cNvGraphicFramePr>
+            <a:graphic>
+              <a:graphicData uri="http://schemas.openxmlformats.org/drawingml/2006/picture">
+                <pic:pic>
+                  <pic:nvPicPr>
+                    <pic:cNvPr id="0" name="mobile_prediction.png"/>
+                    <pic:cNvPicPr/>
+                  </pic:nvPicPr>
+                  <pic:blipFill>
+                    <a:blip r:embed="rId32"/>
+                    <a:stretch>
+                      <a:fillRect/>
+                    </a:stretch>
+                  </pic:blipFill>
+                  <pic:spPr>
+                    <a:xfrm>
+                      <a:off x="0" y="0"/>
+                      <a:ext cx="3000228" cy="6629399"/>
+                    </a:xfrm>
+                    <a:prstGeom prst="rect"/>
+                  </pic:spPr>
+                </pic:pic>
+              </a:graphicData>
+            </a:graphic>
+          </wp:inline>
+        </w:drawing>
+      </w:r>
+    </w:p>
+    <w:p>
+      <w:pPr>
+        <w:pStyle w:val="Caption"/>
+      </w:pPr>
+      <w:r>
+        <w:rPr>
+          <w:b w:val="0"/>
+        </w:rPr>
+        <w:t>Hình 19. Form và kết quả dự đoán tiểu đường của web tại viewport điện thoại.</w:t>
+      </w:r>
+    </w:p>
+    <w:p>
+      <w:pPr>
+        <w:ind w:firstLine="0"/>
+        <w:jc w:val="center"/>
+      </w:pPr>
+      <w:r>
+        <w:drawing>
+          <wp:inline xmlns:a="http://schemas.openxmlformats.org/drawingml/2006/main" xmlns:pic="http://schemas.openxmlformats.org/drawingml/2006/picture">
+            <wp:extent cx="2993922" cy="6629399"/>
+            <wp:docPr id="20" name="Picture 20"/>
+            <wp:cNvGraphicFramePr>
+              <a:graphicFrameLocks noChangeAspect="1"/>
+            </wp:cNvGraphicFramePr>
+            <a:graphic>
+              <a:graphicData uri="http://schemas.openxmlformats.org/drawingml/2006/picture">
+                <pic:pic>
+                  <pic:nvPicPr>
+                    <pic:cNvPr id="0" name="mobile_knowledge_graph.png"/>
+                    <pic:cNvPicPr/>
+                  </pic:nvPicPr>
+                  <pic:blipFill>
+                    <a:blip r:embed="rId33"/>
+                    <a:stretch>
+                      <a:fillRect/>
+                    </a:stretch>
+                  </pic:blipFill>
+                  <pic:spPr>
+                    <a:xfrm>
+                      <a:off x="0" y="0"/>
+                      <a:ext cx="2993922" cy="6629399"/>
+                    </a:xfrm>
+                    <a:prstGeom prst="rect"/>
+                  </pic:spPr>
+                </pic:pic>
+              </a:graphicData>
+            </a:graphic>
+          </wp:inline>
+        </w:drawing>
+      </w:r>
+    </w:p>
+    <w:p>
+      <w:pPr>
+        <w:pStyle w:val="Caption"/>
+      </w:pPr>
+      <w:r>
+        <w:rPr>
+          <w:b w:val="0"/>
+        </w:rPr>
+        <w:t>Hình 20. Knowledge Graph của web tại viewport điện thoại, với canvas co theo chiều rộng và panel chi tiết nằm phía dưới.</w:t>
       </w:r>
     </w:p>
     <w:p>
@@ -16462,7 +16755,7 @@
         </w:rPr>
         <w:t xml:space="preserve">Kaggle. *Vietnam Housing Dataset 2024*. </w:t>
       </w:r>
-      <w:hyperlink r:id="rId28">
+      <w:hyperlink r:id="rId34">
         <w:r>
           <w:rPr>
             <w:color w:val="3E6C8A"/>
@@ -16489,7 +16782,7 @@
         </w:rPr>
         <w:t xml:space="preserve">Nhóm phát triển scikit-learn. *Tài liệu scikit-learn*. </w:t>
       </w:r>
-      <w:hyperlink r:id="rId29">
+      <w:hyperlink r:id="rId35">
         <w:r>
           <w:rPr>
             <w:color w:val="3E6C8A"/>
@@ -16516,7 +16809,7 @@
         </w:rPr>
         <w:t xml:space="preserve">FastAPI. *Tài liệu FastAPI*. </w:t>
       </w:r>
-      <w:hyperlink r:id="rId30">
+      <w:hyperlink r:id="rId36">
         <w:r>
           <w:rPr>
             <w:color w:val="3E6C8A"/>
@@ -16543,7 +16836,7 @@
         </w:rPr>
         <w:t xml:space="preserve">Meta Open Source. *Tài liệu React*. </w:t>
       </w:r>
-      <w:hyperlink r:id="rId31">
+      <w:hyperlink r:id="rId37">
         <w:r>
           <w:rPr>
             <w:color w:val="3E6C8A"/>
@@ -16570,7 +16863,7 @@
         </w:rPr>
         <w:t xml:space="preserve">Vite. *Tài liệu Vite*. </w:t>
       </w:r>
-      <w:hyperlink r:id="rId32">
+      <w:hyperlink r:id="rId38">
         <w:r>
           <w:rPr>
             <w:color w:val="3E6C8A"/>
@@ -16597,7 +16890,7 @@
         </w:rPr>
         <w:t xml:space="preserve">Expo. *Tài liệu Expo*. </w:t>
       </w:r>
-      <w:hyperlink r:id="rId33">
+      <w:hyperlink r:id="rId39">
         <w:r>
           <w:rPr>
             <w:color w:val="3E6C8A"/>
@@ -16624,7 +16917,7 @@
         </w:rPr>
         <w:t xml:space="preserve">Neo4j. *Tài liệu Neo4j*. </w:t>
       </w:r>
-      <w:hyperlink r:id="rId34">
+      <w:hyperlink r:id="rId40">
         <w:r>
           <w:rPr>
             <w:color w:val="3E6C8A"/>
@@ -16651,7 +16944,7 @@
         </w:rPr>
         <w:t xml:space="preserve">Render. *Tài liệu Render*. </w:t>
       </w:r>
-      <w:hyperlink r:id="rId35">
+      <w:hyperlink r:id="rId41">
         <w:r>
           <w:rPr>
             <w:color w:val="3E6C8A"/>
@@ -16678,7 +16971,7 @@
         </w:rPr>
         <w:t xml:space="preserve">Vercel. *Tài liệu Vercel*. </w:t>
       </w:r>
-      <w:hyperlink r:id="rId36">
+      <w:hyperlink r:id="rId42">
         <w:r>
           <w:rPr>
             <w:color w:val="3E6C8A"/>

</xml_diff>